<commit_message>
Add PD15 notes and update re-entry checklist for characterization mission
- Introduced `PD15_notes.md` to document insights and directives from the July 31 meeting with Alex, focusing on sensitivity characterization and statistical fitting.
- Updated `00_READ_ME_FIRST.md` and `CHARLES_CHECKLIST.md` to reflect the new characterization mission phases and clarify the reading order for users.
- Enhanced `04_Pass_A_and_Pass_B_in_Plain_English.md` and `05_Alex_Magnitude_Spec.md` to align with the new focus on sensitivity analysis and fitting processes.
- Archived the previous checklist in `CHARLES_CHECKLIST_archive_20260803.md` to streamline the documentation and emphasize the new approach.

These changes improve the clarity and organization of the re-entry documentation, facilitating better understanding and execution of the PD15 characterization mission.
</commit_message>
<xml_diff>
--- a/transcripts/PD15_notes.docx
+++ b/transcripts/PD15_notes.docx
@@ -15,7 +15,6 @@
           <w:kern w:val="0"/>
           <w:sz w:val="32"/>
           <w:szCs w:val="32"/>
-          <w14:ligatures w14:val="none"/>
         </w:rPr>
       </w:pPr>
       <w:r>
@@ -27,7 +26,6 @@
           <w:kern w:val="0"/>
           <w:sz w:val="32"/>
           <w:szCs w:val="32"/>
-          <w14:ligatures w14:val="none"/>
         </w:rPr>
         <w:t>Paper Directions 15 — my read (corrected labels)</w:t>
       </w:r>
@@ -42,17 +40,15 @@
           <w:kern w:val="0"/>
           <w:sz w:val="20"/>
           <w:szCs w:val="20"/>
-          <w14:ligatures w14:val="none"/>
-        </w:rPr>
-      </w:pPr>
-      <w:r>
-        <w:rPr>
-          <w:rFonts w:ascii="Arial" w:eastAsia="Times New Roman" w:hAnsi="Arial" w:cs="Arial"/>
-          <w:color w:val="3B3B3B"/>
-          <w:kern w:val="0"/>
-          <w:sz w:val="20"/>
-          <w:szCs w:val="20"/>
-          <w14:ligatures w14:val="none"/>
+        </w:rPr>
+      </w:pPr>
+      <w:r>
+        <w:rPr>
+          <w:rFonts w:ascii="Arial" w:eastAsia="Times New Roman" w:hAnsi="Arial" w:cs="Arial"/>
+          <w:color w:val="3B3B3B"/>
+          <w:kern w:val="0"/>
+          <w:sz w:val="20"/>
+          <w:szCs w:val="20"/>
         </w:rPr>
         <w:t>Source: </w:t>
       </w:r>
@@ -63,7 +59,6 @@
           <w:kern w:val="0"/>
           <w:sz w:val="18"/>
           <w:szCs w:val="18"/>
-          <w14:ligatures w14:val="none"/>
         </w:rPr>
         <w:t>transcripts/20260731_Paper_Directions_15_otter_ai_transcript.docx</w:t>
       </w:r>
@@ -74,19 +69,10 @@
           <w:kern w:val="0"/>
           <w:sz w:val="20"/>
           <w:szCs w:val="20"/>
-          <w14:ligatures w14:val="none"/>
         </w:rPr>
         <w:t> (~44 min, Jul 31).</w:t>
       </w:r>
       <w:r>
-        <w:rPr>
-          <w:rFonts w:ascii="Arial" w:eastAsia="Times New Roman" w:hAnsi="Arial" w:cs="Arial"/>
-          <w:color w:val="3B3B3B"/>
-          <w:kern w:val="0"/>
-          <w:sz w:val="20"/>
-          <w:szCs w:val="20"/>
-          <w14:ligatures w14:val="none"/>
-        </w:rPr>
         <w:br/>
       </w:r>
       <w:r>
@@ -98,7 +84,6 @@
           <w:kern w:val="0"/>
           <w:sz w:val="20"/>
           <w:szCs w:val="20"/>
-          <w14:ligatures w14:val="none"/>
         </w:rPr>
         <w:t>Slide convention below = your gallery (</w:t>
       </w:r>
@@ -111,7 +96,6 @@
           <w:kern w:val="0"/>
           <w:sz w:val="18"/>
           <w:szCs w:val="18"/>
-          <w14:ligatures w14:val="none"/>
         </w:rPr>
         <w:t>So_Far_</w:t>
       </w:r>
@@ -124,7 +108,6 @@
           <w:kern w:val="0"/>
           <w:sz w:val="20"/>
           <w:szCs w:val="20"/>
-          <w14:ligatures w14:val="none"/>
         </w:rPr>
         <w:t> slides 1–3):</w:t>
       </w:r>
@@ -132,13 +115,21 @@
     <w:tbl>
       <w:tblPr>
         <w:tblW w:w="0" w:type="auto"/>
+        <w:tblBorders>
+          <w:top w:val="single" w:sz="4" w:space="0" w:color="auto"/>
+          <w:left w:val="single" w:sz="4" w:space="0" w:color="auto"/>
+          <w:bottom w:val="single" w:sz="4" w:space="0" w:color="auto"/>
+          <w:right w:val="single" w:sz="4" w:space="0" w:color="auto"/>
+          <w:insideH w:val="single" w:sz="4" w:space="0" w:color="auto"/>
+          <w:insideV w:val="single" w:sz="4" w:space="0" w:color="auto"/>
+        </w:tblBorders>
         <w:tblCellMar>
           <w:top w:w="15" w:type="dxa"/>
           <w:left w:w="15" w:type="dxa"/>
           <w:bottom w:w="15" w:type="dxa"/>
           <w:right w:w="15" w:type="dxa"/>
         </w:tblCellMar>
-        <w:tblLook w:val="04A0" w:firstRow="1" w:lastRow="0" w:firstColumn="1" w:lastColumn="0" w:noHBand="0" w:noVBand="1"/>
+        <w:tblLook w:val="07E0" w:firstRow="1" w:lastRow="1" w:firstColumn="1" w:lastColumn="1" w:noHBand="1" w:noVBand="1"/>
       </w:tblPr>
       <w:tblGrid>
         <w:gridCol w:w="777"/>
@@ -152,6 +143,12 @@
         <w:tc>
           <w:tcPr>
             <w:tcW w:w="0" w:type="auto"/>
+            <w:tcBorders>
+              <w:top w:val="single" w:sz="4" w:space="0" w:color="auto"/>
+              <w:left w:val="single" w:sz="4" w:space="0" w:color="auto"/>
+              <w:bottom w:val="single" w:sz="4" w:space="0" w:color="auto"/>
+              <w:right w:val="single" w:sz="4" w:space="0" w:color="auto"/>
+            </w:tcBorders>
             <w:noWrap/>
             <w:tcMar>
               <w:top w:w="75" w:type="dxa"/>
@@ -169,7 +166,6 @@
                 <w:b/>
                 <w:bCs/>
                 <w:kern w:val="0"/>
-                <w14:ligatures w14:val="none"/>
               </w:rPr>
             </w:pPr>
             <w:r>
@@ -178,7 +174,6 @@
                 <w:b/>
                 <w:bCs/>
                 <w:kern w:val="0"/>
-                <w14:ligatures w14:val="none"/>
               </w:rPr>
               <w:t>Slide</w:t>
             </w:r>
@@ -187,6 +182,12 @@
         <w:tc>
           <w:tcPr>
             <w:tcW w:w="0" w:type="auto"/>
+            <w:tcBorders>
+              <w:top w:val="single" w:sz="4" w:space="0" w:color="auto"/>
+              <w:left w:val="single" w:sz="4" w:space="0" w:color="auto"/>
+              <w:bottom w:val="single" w:sz="4" w:space="0" w:color="auto"/>
+              <w:right w:val="single" w:sz="4" w:space="0" w:color="auto"/>
+            </w:tcBorders>
             <w:noWrap/>
             <w:tcMar>
               <w:top w:w="75" w:type="dxa"/>
@@ -204,7 +205,6 @@
                 <w:b/>
                 <w:bCs/>
                 <w:kern w:val="0"/>
-                <w14:ligatures w14:val="none"/>
               </w:rPr>
             </w:pPr>
             <w:r>
@@ -213,7 +213,6 @@
                 <w:b/>
                 <w:bCs/>
                 <w:kern w:val="0"/>
-                <w14:ligatures w14:val="none"/>
               </w:rPr>
               <w:t>Pass</w:t>
             </w:r>
@@ -222,6 +221,12 @@
         <w:tc>
           <w:tcPr>
             <w:tcW w:w="0" w:type="auto"/>
+            <w:tcBorders>
+              <w:top w:val="single" w:sz="4" w:space="0" w:color="auto"/>
+              <w:left w:val="single" w:sz="4" w:space="0" w:color="auto"/>
+              <w:bottom w:val="single" w:sz="4" w:space="0" w:color="auto"/>
+              <w:right w:val="single" w:sz="4" w:space="0" w:color="auto"/>
+            </w:tcBorders>
             <w:noWrap/>
             <w:tcMar>
               <w:top w:w="75" w:type="dxa"/>
@@ -239,7 +244,6 @@
                 <w:b/>
                 <w:bCs/>
                 <w:kern w:val="0"/>
-                <w14:ligatures w14:val="none"/>
               </w:rPr>
             </w:pPr>
             <w:r>
@@ -248,7 +252,6 @@
                 <w:b/>
                 <w:bCs/>
                 <w:kern w:val="0"/>
-                <w14:ligatures w14:val="none"/>
               </w:rPr>
               <w:t>Knob</w:t>
             </w:r>
@@ -259,6 +262,12 @@
         <w:tc>
           <w:tcPr>
             <w:tcW w:w="0" w:type="auto"/>
+            <w:tcBorders>
+              <w:top w:val="single" w:sz="4" w:space="0" w:color="auto"/>
+              <w:left w:val="single" w:sz="4" w:space="0" w:color="auto"/>
+              <w:bottom w:val="single" w:sz="4" w:space="0" w:color="auto"/>
+              <w:right w:val="single" w:sz="4" w:space="0" w:color="auto"/>
+            </w:tcBorders>
             <w:tcMar>
               <w:top w:w="75" w:type="dxa"/>
               <w:left w:w="135" w:type="dxa"/>
@@ -273,14 +282,12 @@
               <w:rPr>
                 <w:rFonts w:ascii="Times New Roman" w:eastAsia="Times New Roman" w:hAnsi="Times New Roman" w:cs="Times New Roman"/>
                 <w:kern w:val="0"/>
-                <w14:ligatures w14:val="none"/>
               </w:rPr>
             </w:pPr>
             <w:r>
               <w:rPr>
                 <w:rFonts w:ascii="Times New Roman" w:eastAsia="Times New Roman" w:hAnsi="Times New Roman" w:cs="Times New Roman"/>
                 <w:kern w:val="0"/>
-                <w14:ligatures w14:val="none"/>
               </w:rPr>
               <w:t>1</w:t>
             </w:r>
@@ -289,6 +296,12 @@
         <w:tc>
           <w:tcPr>
             <w:tcW w:w="0" w:type="auto"/>
+            <w:tcBorders>
+              <w:top w:val="single" w:sz="4" w:space="0" w:color="auto"/>
+              <w:left w:val="single" w:sz="4" w:space="0" w:color="auto"/>
+              <w:bottom w:val="single" w:sz="4" w:space="0" w:color="auto"/>
+              <w:right w:val="single" w:sz="4" w:space="0" w:color="auto"/>
+            </w:tcBorders>
             <w:tcMar>
               <w:top w:w="75" w:type="dxa"/>
               <w:left w:w="135" w:type="dxa"/>
@@ -303,7 +316,6 @@
               <w:rPr>
                 <w:rFonts w:ascii="Times New Roman" w:eastAsia="Times New Roman" w:hAnsi="Times New Roman" w:cs="Times New Roman"/>
                 <w:kern w:val="0"/>
-                <w14:ligatures w14:val="none"/>
               </w:rPr>
             </w:pPr>
             <w:r>
@@ -312,7 +324,6 @@
                 <w:b/>
                 <w:bCs/>
                 <w:kern w:val="0"/>
-                <w14:ligatures w14:val="none"/>
               </w:rPr>
               <w:t>Pass A</w:t>
             </w:r>
@@ -321,6 +332,12 @@
         <w:tc>
           <w:tcPr>
             <w:tcW w:w="0" w:type="auto"/>
+            <w:tcBorders>
+              <w:top w:val="single" w:sz="4" w:space="0" w:color="auto"/>
+              <w:left w:val="single" w:sz="4" w:space="0" w:color="auto"/>
+              <w:bottom w:val="single" w:sz="4" w:space="0" w:color="auto"/>
+              <w:right w:val="single" w:sz="4" w:space="0" w:color="auto"/>
+            </w:tcBorders>
             <w:tcMar>
               <w:top w:w="75" w:type="dxa"/>
               <w:left w:w="135" w:type="dxa"/>
@@ -335,14 +352,12 @@
               <w:rPr>
                 <w:rFonts w:ascii="Times New Roman" w:eastAsia="Times New Roman" w:hAnsi="Times New Roman" w:cs="Times New Roman"/>
                 <w:kern w:val="0"/>
-                <w14:ligatures w14:val="none"/>
               </w:rPr>
             </w:pPr>
             <w:r>
               <w:rPr>
                 <w:rFonts w:ascii="Times New Roman" w:eastAsia="Times New Roman" w:hAnsi="Times New Roman" w:cs="Times New Roman"/>
                 <w:kern w:val="0"/>
-                <w14:ligatures w14:val="none"/>
               </w:rPr>
               <w:t>Empirical (no sim knob)</w:t>
             </w:r>
@@ -353,6 +368,12 @@
         <w:tc>
           <w:tcPr>
             <w:tcW w:w="0" w:type="auto"/>
+            <w:tcBorders>
+              <w:top w:val="single" w:sz="4" w:space="0" w:color="auto"/>
+              <w:left w:val="single" w:sz="4" w:space="0" w:color="auto"/>
+              <w:bottom w:val="single" w:sz="4" w:space="0" w:color="auto"/>
+              <w:right w:val="single" w:sz="4" w:space="0" w:color="auto"/>
+            </w:tcBorders>
             <w:tcMar>
               <w:top w:w="75" w:type="dxa"/>
               <w:left w:w="135" w:type="dxa"/>
@@ -367,14 +388,12 @@
               <w:rPr>
                 <w:rFonts w:ascii="Times New Roman" w:eastAsia="Times New Roman" w:hAnsi="Times New Roman" w:cs="Times New Roman"/>
                 <w:kern w:val="0"/>
-                <w14:ligatures w14:val="none"/>
               </w:rPr>
             </w:pPr>
             <w:r>
               <w:rPr>
                 <w:rFonts w:ascii="Times New Roman" w:eastAsia="Times New Roman" w:hAnsi="Times New Roman" w:cs="Times New Roman"/>
                 <w:kern w:val="0"/>
-                <w14:ligatures w14:val="none"/>
               </w:rPr>
               <w:t>2</w:t>
             </w:r>
@@ -383,6 +402,12 @@
         <w:tc>
           <w:tcPr>
             <w:tcW w:w="0" w:type="auto"/>
+            <w:tcBorders>
+              <w:top w:val="single" w:sz="4" w:space="0" w:color="auto"/>
+              <w:left w:val="single" w:sz="4" w:space="0" w:color="auto"/>
+              <w:bottom w:val="single" w:sz="4" w:space="0" w:color="auto"/>
+              <w:right w:val="single" w:sz="4" w:space="0" w:color="auto"/>
+            </w:tcBorders>
             <w:tcMar>
               <w:top w:w="75" w:type="dxa"/>
               <w:left w:w="135" w:type="dxa"/>
@@ -397,7 +422,6 @@
               <w:rPr>
                 <w:rFonts w:ascii="Times New Roman" w:eastAsia="Times New Roman" w:hAnsi="Times New Roman" w:cs="Times New Roman"/>
                 <w:kern w:val="0"/>
-                <w14:ligatures w14:val="none"/>
               </w:rPr>
             </w:pPr>
             <w:r>
@@ -406,7 +430,6 @@
                 <w:b/>
                 <w:bCs/>
                 <w:kern w:val="0"/>
-                <w14:ligatures w14:val="none"/>
               </w:rPr>
               <w:t>Pass B</w:t>
             </w:r>
@@ -415,6 +438,12 @@
         <w:tc>
           <w:tcPr>
             <w:tcW w:w="0" w:type="auto"/>
+            <w:tcBorders>
+              <w:top w:val="single" w:sz="4" w:space="0" w:color="auto"/>
+              <w:left w:val="single" w:sz="4" w:space="0" w:color="auto"/>
+              <w:bottom w:val="single" w:sz="4" w:space="0" w:color="auto"/>
+              <w:right w:val="single" w:sz="4" w:space="0" w:color="auto"/>
+            </w:tcBorders>
             <w:tcMar>
               <w:top w:w="75" w:type="dxa"/>
               <w:left w:w="135" w:type="dxa"/>
@@ -429,7 +458,6 @@
               <w:rPr>
                 <w:rFonts w:ascii="Times New Roman" w:eastAsia="Times New Roman" w:hAnsi="Times New Roman" w:cs="Times New Roman"/>
                 <w:kern w:val="0"/>
-                <w14:ligatures w14:val="none"/>
               </w:rPr>
             </w:pPr>
             <w:r>
@@ -438,7 +466,6 @@
                 <w:b/>
                 <w:bCs/>
                 <w:kern w:val="0"/>
-                <w14:ligatures w14:val="none"/>
               </w:rPr>
               <w:t>λ</w:t>
             </w:r>
@@ -446,7 +473,6 @@
               <w:rPr>
                 <w:rFonts w:ascii="Times New Roman" w:eastAsia="Times New Roman" w:hAnsi="Times New Roman" w:cs="Times New Roman"/>
                 <w:kern w:val="0"/>
-                <w14:ligatures w14:val="none"/>
               </w:rPr>
               <w:t> in score</w:t>
             </w:r>
@@ -457,6 +483,12 @@
         <w:tc>
           <w:tcPr>
             <w:tcW w:w="0" w:type="auto"/>
+            <w:tcBorders>
+              <w:top w:val="single" w:sz="4" w:space="0" w:color="auto"/>
+              <w:left w:val="single" w:sz="4" w:space="0" w:color="auto"/>
+              <w:bottom w:val="single" w:sz="4" w:space="0" w:color="auto"/>
+              <w:right w:val="single" w:sz="4" w:space="0" w:color="auto"/>
+            </w:tcBorders>
             <w:tcMar>
               <w:top w:w="75" w:type="dxa"/>
               <w:left w:w="135" w:type="dxa"/>
@@ -471,14 +503,12 @@
               <w:rPr>
                 <w:rFonts w:ascii="Times New Roman" w:eastAsia="Times New Roman" w:hAnsi="Times New Roman" w:cs="Times New Roman"/>
                 <w:kern w:val="0"/>
-                <w14:ligatures w14:val="none"/>
               </w:rPr>
             </w:pPr>
             <w:r>
               <w:rPr>
                 <w:rFonts w:ascii="Times New Roman" w:eastAsia="Times New Roman" w:hAnsi="Times New Roman" w:cs="Times New Roman"/>
                 <w:kern w:val="0"/>
-                <w14:ligatures w14:val="none"/>
               </w:rPr>
               <w:t>3</w:t>
             </w:r>
@@ -487,6 +517,12 @@
         <w:tc>
           <w:tcPr>
             <w:tcW w:w="0" w:type="auto"/>
+            <w:tcBorders>
+              <w:top w:val="single" w:sz="4" w:space="0" w:color="auto"/>
+              <w:left w:val="single" w:sz="4" w:space="0" w:color="auto"/>
+              <w:bottom w:val="single" w:sz="4" w:space="0" w:color="auto"/>
+              <w:right w:val="single" w:sz="4" w:space="0" w:color="auto"/>
+            </w:tcBorders>
             <w:tcMar>
               <w:top w:w="75" w:type="dxa"/>
               <w:left w:w="135" w:type="dxa"/>
@@ -501,7 +537,6 @@
               <w:rPr>
                 <w:rFonts w:ascii="Times New Roman" w:eastAsia="Times New Roman" w:hAnsi="Times New Roman" w:cs="Times New Roman"/>
                 <w:kern w:val="0"/>
-                <w14:ligatures w14:val="none"/>
               </w:rPr>
             </w:pPr>
             <w:r>
@@ -510,7 +545,6 @@
                 <w:b/>
                 <w:bCs/>
                 <w:kern w:val="0"/>
-                <w14:ligatures w14:val="none"/>
               </w:rPr>
               <w:t>Pass C</w:t>
             </w:r>
@@ -519,6 +553,12 @@
         <w:tc>
           <w:tcPr>
             <w:tcW w:w="0" w:type="auto"/>
+            <w:tcBorders>
+              <w:top w:val="single" w:sz="4" w:space="0" w:color="auto"/>
+              <w:left w:val="single" w:sz="4" w:space="0" w:color="auto"/>
+              <w:bottom w:val="single" w:sz="4" w:space="0" w:color="auto"/>
+              <w:right w:val="single" w:sz="4" w:space="0" w:color="auto"/>
+            </w:tcBorders>
             <w:tcMar>
               <w:top w:w="75" w:type="dxa"/>
               <w:left w:w="135" w:type="dxa"/>
@@ -533,7 +573,6 @@
               <w:rPr>
                 <w:rFonts w:ascii="Times New Roman" w:eastAsia="Times New Roman" w:hAnsi="Times New Roman" w:cs="Times New Roman"/>
                 <w:kern w:val="0"/>
-                <w14:ligatures w14:val="none"/>
               </w:rPr>
             </w:pPr>
             <w:r>
@@ -542,7 +581,6 @@
                 <w:b/>
                 <w:bCs/>
                 <w:kern w:val="0"/>
-                <w14:ligatures w14:val="none"/>
               </w:rPr>
               <w:t>ρ</w:t>
             </w:r>
@@ -550,7 +588,6 @@
               <w:rPr>
                 <w:rFonts w:ascii="Times New Roman" w:eastAsia="Times New Roman" w:hAnsi="Times New Roman" w:cs="Times New Roman"/>
                 <w:kern w:val="0"/>
-                <w14:ligatures w14:val="none"/>
               </w:rPr>
               <w:t> in assignment</w:t>
             </w:r>
@@ -566,22 +603,8 @@
           <w:kern w:val="0"/>
           <w:sz w:val="20"/>
           <w:szCs w:val="20"/>
-          <w14:ligatures w14:val="none"/>
-        </w:rPr>
-      </w:pPr>
-      <w:r>
-        <w:rPr>
-          <w:noProof/>
-        </w:rPr>
-      </w:r>
-      <w:r>
-        <w:pict w14:anchorId="5DA64D24">
-          <v:rect id="Horizontal Line 8" o:spid="_x0000_s1032" style="width:540pt;height:.05pt;visibility:visible;mso-wrap-style:square;mso-left-percent:-10001;mso-top-percent:-10001;mso-position-horizontal:absolute;mso-position-horizontal-relative:char;mso-position-vertical:absolute;mso-position-vertical-relative:line;mso-left-percent:-10001;mso-top-percent:-10001;v-text-anchor:top" o:gfxdata="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" filled="f">
-            <o:lock v:ext="edit" rotation="t" aspectratio="t" verticies="t" text="t" shapetype="t"/>
-            <w10:anchorlock/>
-          </v:rect>
-        </w:pict>
-      </w:r>
+        </w:rPr>
+      </w:pPr>
     </w:p>
     <w:p>
       <w:pPr>
@@ -596,7 +619,6 @@
           <w:kern w:val="0"/>
           <w:sz w:val="32"/>
           <w:szCs w:val="32"/>
-          <w14:ligatures w14:val="none"/>
         </w:rPr>
       </w:pPr>
       <w:r>
@@ -608,7 +630,6 @@
           <w:kern w:val="0"/>
           <w:sz w:val="32"/>
           <w:szCs w:val="32"/>
-          <w14:ligatures w14:val="none"/>
         </w:rPr>
         <w:t>Headline</w:t>
       </w:r>
@@ -623,17 +644,15 @@
           <w:kern w:val="0"/>
           <w:sz w:val="20"/>
           <w:szCs w:val="20"/>
-          <w14:ligatures w14:val="none"/>
-        </w:rPr>
-      </w:pPr>
-      <w:r>
-        <w:rPr>
-          <w:rFonts w:ascii="Arial" w:eastAsia="Times New Roman" w:hAnsi="Arial" w:cs="Arial"/>
-          <w:color w:val="3B3B3B"/>
-          <w:kern w:val="0"/>
-          <w:sz w:val="20"/>
-          <w:szCs w:val="20"/>
-          <w14:ligatures w14:val="none"/>
+        </w:rPr>
+      </w:pPr>
+      <w:r>
+        <w:rPr>
+          <w:rFonts w:ascii="Arial" w:eastAsia="Times New Roman" w:hAnsi="Arial" w:cs="Arial"/>
+          <w:color w:val="3B3B3B"/>
+          <w:kern w:val="0"/>
+          <w:sz w:val="20"/>
+          <w:szCs w:val="20"/>
         </w:rPr>
         <w:t>Alex is pleased. You’re not off track. The Pass work is </w:t>
       </w:r>
@@ -646,7 +665,6 @@
           <w:kern w:val="0"/>
           <w:sz w:val="20"/>
           <w:szCs w:val="20"/>
-          <w14:ligatures w14:val="none"/>
         </w:rPr>
         <w:t>right</w:t>
       </w:r>
@@ -657,7 +675,6 @@
           <w:kern w:val="0"/>
           <w:sz w:val="20"/>
           <w:szCs w:val="20"/>
-          <w14:ligatures w14:val="none"/>
         </w:rPr>
         <w:t>. The shift is </w:t>
       </w:r>
@@ -670,7 +687,6 @@
           <w:kern w:val="0"/>
           <w:sz w:val="20"/>
           <w:szCs w:val="20"/>
-          <w14:ligatures w14:val="none"/>
         </w:rPr>
         <w:t>directedness</w:t>
       </w:r>
@@ -681,7 +697,6 @@
           <w:kern w:val="0"/>
           <w:sz w:val="20"/>
           <w:szCs w:val="20"/>
-          <w14:ligatures w14:val="none"/>
         </w:rPr>
         <w:t>: fewer items, clearer hierarchy, outputs as a </w:t>
       </w:r>
@@ -694,7 +709,6 @@
           <w:kern w:val="0"/>
           <w:sz w:val="20"/>
           <w:szCs w:val="20"/>
-          <w14:ligatures w14:val="none"/>
         </w:rPr>
         <w:t>characterization slide series</w:t>
       </w:r>
@@ -705,7 +719,6 @@
           <w:kern w:val="0"/>
           <w:sz w:val="20"/>
           <w:szCs w:val="20"/>
-          <w14:ligatures w14:val="none"/>
         </w:rPr>
         <w:t> — and a hard line between </w:t>
       </w:r>
@@ -718,7 +731,6 @@
           <w:kern w:val="0"/>
           <w:sz w:val="20"/>
           <w:szCs w:val="20"/>
-          <w14:ligatures w14:val="none"/>
         </w:rPr>
         <w:t>sensitivity analysis</w:t>
       </w:r>
@@ -729,7 +741,6 @@
           <w:kern w:val="0"/>
           <w:sz w:val="20"/>
           <w:szCs w:val="20"/>
-          <w14:ligatures w14:val="none"/>
         </w:rPr>
         <w:t> (now) and </w:t>
       </w:r>
@@ -742,7 +753,6 @@
           <w:kern w:val="0"/>
           <w:sz w:val="20"/>
           <w:szCs w:val="20"/>
-          <w14:ligatures w14:val="none"/>
         </w:rPr>
         <w:t>statistical parameter fitting</w:t>
       </w:r>
@@ -753,7 +763,6 @@
           <w:kern w:val="0"/>
           <w:sz w:val="20"/>
           <w:szCs w:val="20"/>
-          <w14:ligatures w14:val="none"/>
         </w:rPr>
         <w:t> (next big insight).</w:t>
       </w:r>
@@ -768,17 +777,15 @@
           <w:kern w:val="0"/>
           <w:sz w:val="20"/>
           <w:szCs w:val="20"/>
-          <w14:ligatures w14:val="none"/>
-        </w:rPr>
-      </w:pPr>
-      <w:r>
-        <w:rPr>
-          <w:rFonts w:ascii="Arial" w:eastAsia="Times New Roman" w:hAnsi="Arial" w:cs="Arial"/>
-          <w:color w:val="3B3B3B"/>
-          <w:kern w:val="0"/>
-          <w:sz w:val="20"/>
-          <w:szCs w:val="20"/>
-          <w14:ligatures w14:val="none"/>
+        </w:rPr>
+      </w:pPr>
+      <w:r>
+        <w:rPr>
+          <w:rFonts w:ascii="Arial" w:eastAsia="Times New Roman" w:hAnsi="Arial" w:cs="Arial"/>
+          <w:color w:val="3B3B3B"/>
+          <w:kern w:val="0"/>
+          <w:sz w:val="20"/>
+          <w:szCs w:val="20"/>
         </w:rPr>
         <w:t>His closing: </w:t>
       </w:r>
@@ -791,7 +798,6 @@
           <w:kern w:val="0"/>
           <w:sz w:val="20"/>
           <w:szCs w:val="20"/>
-          <w14:ligatures w14:val="none"/>
         </w:rPr>
         <w:t>“This is still basically what I asked for two weeks ago… we need to be more directed.”</w:t>
       </w:r>
@@ -804,22 +810,8 @@
           <w:kern w:val="0"/>
           <w:sz w:val="20"/>
           <w:szCs w:val="20"/>
-          <w14:ligatures w14:val="none"/>
-        </w:rPr>
-      </w:pPr>
-      <w:r>
-        <w:rPr>
-          <w:noProof/>
-        </w:rPr>
-      </w:r>
-      <w:r>
-        <w:pict w14:anchorId="2574CC43">
-          <v:rect id="Horizontal Line 9" o:spid="_x0000_s1031" style="width:540pt;height:.05pt;visibility:visible;mso-wrap-style:square;mso-left-percent:-10001;mso-top-percent:-10001;mso-position-horizontal:absolute;mso-position-horizontal-relative:char;mso-position-vertical:absolute;mso-position-vertical-relative:line;mso-left-percent:-10001;mso-top-percent:-10001;v-text-anchor:top" o:gfxdata="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" filled="f">
-            <o:lock v:ext="edit" rotation="t" aspectratio="t" verticies="t" text="t" shapetype="t"/>
-            <w10:anchorlock/>
-          </v:rect>
-        </w:pict>
-      </w:r>
+        </w:rPr>
+      </w:pPr>
     </w:p>
     <w:p>
       <w:pPr>
@@ -834,7 +826,6 @@
           <w:kern w:val="0"/>
           <w:sz w:val="32"/>
           <w:szCs w:val="32"/>
-          <w14:ligatures w14:val="none"/>
         </w:rPr>
       </w:pPr>
       <w:r>
@@ -846,7 +837,6 @@
           <w:kern w:val="0"/>
           <w:sz w:val="32"/>
           <w:szCs w:val="32"/>
-          <w14:ligatures w14:val="none"/>
         </w:rPr>
         <w:t>What landed well</w:t>
       </w:r>
@@ -861,19 +851,17 @@
           <w:kern w:val="0"/>
           <w:sz w:val="20"/>
           <w:szCs w:val="20"/>
-          <w14:ligatures w14:val="none"/>
-        </w:rPr>
-      </w:pPr>
-      <w:r>
-        <w:rPr>
-          <w:rFonts w:ascii="Arial" w:eastAsia="Times New Roman" w:hAnsi="Arial" w:cs="Arial"/>
-          <w:b/>
-          <w:bCs/>
-          <w:color w:val="3B3B3B"/>
-          <w:kern w:val="0"/>
-          <w:sz w:val="20"/>
-          <w:szCs w:val="20"/>
-          <w14:ligatures w14:val="none"/>
+        </w:rPr>
+      </w:pPr>
+      <w:r>
+        <w:rPr>
+          <w:rFonts w:ascii="Arial" w:eastAsia="Times New Roman" w:hAnsi="Arial" w:cs="Arial"/>
+          <w:b/>
+          <w:bCs/>
+          <w:color w:val="3B3B3B"/>
+          <w:kern w:val="0"/>
+          <w:sz w:val="20"/>
+          <w:szCs w:val="20"/>
         </w:rPr>
         <w:t>Pass C / ρ:</w:t>
       </w:r>
@@ -884,7 +872,6 @@
           <w:kern w:val="0"/>
           <w:sz w:val="20"/>
           <w:szCs w:val="20"/>
-          <w14:ligatures w14:val="none"/>
         </w:rPr>
         <w:t> Assortativity answered cleanly — flat without ρ, roster/peer effect appears with ρ. He called that “really good.”</w:t>
       </w:r>
@@ -899,19 +886,17 @@
           <w:kern w:val="0"/>
           <w:sz w:val="20"/>
           <w:szCs w:val="20"/>
-          <w14:ligatures w14:val="none"/>
-        </w:rPr>
-      </w:pPr>
-      <w:r>
-        <w:rPr>
-          <w:rFonts w:ascii="Arial" w:eastAsia="Times New Roman" w:hAnsi="Arial" w:cs="Arial"/>
-          <w:b/>
-          <w:bCs/>
-          <w:color w:val="3B3B3B"/>
-          <w:kern w:val="0"/>
-          <w:sz w:val="20"/>
-          <w:szCs w:val="20"/>
-          <w14:ligatures w14:val="none"/>
+        </w:rPr>
+      </w:pPr>
+      <w:r>
+        <w:rPr>
+          <w:rFonts w:ascii="Arial" w:eastAsia="Times New Roman" w:hAnsi="Arial" w:cs="Arial"/>
+          <w:b/>
+          <w:bCs/>
+          <w:color w:val="3B3B3B"/>
+          <w:kern w:val="0"/>
+          <w:sz w:val="20"/>
+          <w:szCs w:val="20"/>
         </w:rPr>
         <w:t>Pass B / λ:</w:t>
       </w:r>
@@ -922,7 +907,6 @@
           <w:kern w:val="0"/>
           <w:sz w:val="20"/>
           <w:szCs w:val="20"/>
-          <w14:ligatures w14:val="none"/>
         </w:rPr>
         <w:t> Directionally right (λ = 0 vs λ &gt; 0 bends the curve), but </w:t>
       </w:r>
@@ -935,7 +919,6 @@
           <w:kern w:val="0"/>
           <w:sz w:val="20"/>
           <w:szCs w:val="20"/>
-          <w14:ligatures w14:val="none"/>
         </w:rPr>
         <w:t>incomplete</w:t>
       </w:r>
@@ -946,7 +929,6 @@
           <w:kern w:val="0"/>
           <w:sz w:val="20"/>
           <w:szCs w:val="20"/>
-          <w14:ligatures w14:val="none"/>
         </w:rPr>
         <w:t> — needs the same systematic treatment as ρ, plus the double-plot ask below.</w:t>
       </w:r>
@@ -961,19 +943,17 @@
           <w:kern w:val="0"/>
           <w:sz w:val="20"/>
           <w:szCs w:val="20"/>
-          <w14:ligatures w14:val="none"/>
-        </w:rPr>
-      </w:pPr>
-      <w:r>
-        <w:rPr>
-          <w:rFonts w:ascii="Arial" w:eastAsia="Times New Roman" w:hAnsi="Arial" w:cs="Arial"/>
-          <w:b/>
-          <w:bCs/>
-          <w:color w:val="3B3B3B"/>
-          <w:kern w:val="0"/>
-          <w:sz w:val="20"/>
-          <w:szCs w:val="20"/>
-          <w14:ligatures w14:val="none"/>
+        </w:rPr>
+      </w:pPr>
+      <w:r>
+        <w:rPr>
+          <w:rFonts w:ascii="Arial" w:eastAsia="Times New Roman" w:hAnsi="Arial" w:cs="Arial"/>
+          <w:b/>
+          <w:bCs/>
+          <w:color w:val="3B3B3B"/>
+          <w:kern w:val="0"/>
+          <w:sz w:val="20"/>
+          <w:szCs w:val="20"/>
         </w:rPr>
         <w:t>Pass A / empirical:</w:t>
       </w:r>
@@ -984,7 +964,6 @@
           <w:kern w:val="0"/>
           <w:sz w:val="20"/>
           <w:szCs w:val="20"/>
-          <w14:ligatures w14:val="none"/>
         </w:rPr>
         <w:t> The real-data side-by-side (talent vs poolq_loo) is the anchor. The “two x-axes” conversation is about making the </w:t>
       </w:r>
@@ -997,7 +976,6 @@
           <w:kern w:val="0"/>
           <w:sz w:val="20"/>
           <w:szCs w:val="20"/>
-          <w14:ligatures w14:val="none"/>
         </w:rPr>
         <w:t>generative</w:t>
       </w:r>
@@ -1008,7 +986,6 @@
           <w:kern w:val="0"/>
           <w:sz w:val="20"/>
           <w:szCs w:val="20"/>
-          <w14:ligatures w14:val="none"/>
         </w:rPr>
         <w:t> slides show the same dual readout the empirical slide already implies.</w:t>
       </w:r>
@@ -1023,19 +1000,17 @@
           <w:kern w:val="0"/>
           <w:sz w:val="20"/>
           <w:szCs w:val="20"/>
-          <w14:ligatures w14:val="none"/>
-        </w:rPr>
-      </w:pPr>
-      <w:r>
-        <w:rPr>
-          <w:rFonts w:ascii="Arial" w:eastAsia="Times New Roman" w:hAnsi="Arial" w:cs="Arial"/>
-          <w:b/>
-          <w:bCs/>
-          <w:color w:val="3B3B3B"/>
-          <w:kern w:val="0"/>
-          <w:sz w:val="20"/>
-          <w:szCs w:val="20"/>
-          <w14:ligatures w14:val="none"/>
+        </w:rPr>
+      </w:pPr>
+      <w:r>
+        <w:rPr>
+          <w:rFonts w:ascii="Arial" w:eastAsia="Times New Roman" w:hAnsi="Arial" w:cs="Arial"/>
+          <w:b/>
+          <w:bCs/>
+          <w:color w:val="3B3B3B"/>
+          <w:kern w:val="0"/>
+          <w:sz w:val="20"/>
+          <w:szCs w:val="20"/>
         </w:rPr>
         <w:t>Model simplicity:</w:t>
       </w:r>
@@ -1046,7 +1021,6 @@
           <w:kern w:val="0"/>
           <w:sz w:val="20"/>
           <w:szCs w:val="20"/>
-          <w14:ligatures w14:val="none"/>
         </w:rPr>
         <w:t> Collapsed </w:t>
       </w:r>
@@ -1108,7 +1082,6 @@
           <w:kern w:val="0"/>
           <w:sz w:val="20"/>
           <w:szCs w:val="20"/>
-          <w14:ligatures w14:val="none"/>
         </w:rPr>
         <w:t> is fine for this paper. B vs D decomposition is parked — development benefits of good teams are real but not identifiable in promotion data yet → one black-box </w:t>
       </w:r>
@@ -1121,7 +1094,6 @@
           <w:kern w:val="0"/>
           <w:sz w:val="20"/>
           <w:szCs w:val="20"/>
-          <w14:ligatures w14:val="none"/>
         </w:rPr>
         <w:t>L</w:t>
       </w:r>
@@ -1132,7 +1104,6 @@
           <w:kern w:val="0"/>
           <w:sz w:val="20"/>
           <w:szCs w:val="20"/>
-          <w14:ligatures w14:val="none"/>
         </w:rPr>
         <w:t>.</w:t>
       </w:r>
@@ -1147,19 +1118,17 @@
           <w:kern w:val="0"/>
           <w:sz w:val="20"/>
           <w:szCs w:val="20"/>
-          <w14:ligatures w14:val="none"/>
-        </w:rPr>
-      </w:pPr>
-      <w:r>
-        <w:rPr>
-          <w:rFonts w:ascii="Arial" w:eastAsia="Times New Roman" w:hAnsi="Arial" w:cs="Arial"/>
-          <w:b/>
-          <w:bCs/>
-          <w:color w:val="3B3B3B"/>
-          <w:kern w:val="0"/>
-          <w:sz w:val="20"/>
-          <w:szCs w:val="20"/>
-          <w14:ligatures w14:val="none"/>
+        </w:rPr>
+      </w:pPr>
+      <w:r>
+        <w:rPr>
+          <w:rFonts w:ascii="Arial" w:eastAsia="Times New Roman" w:hAnsi="Arial" w:cs="Arial"/>
+          <w:b/>
+          <w:bCs/>
+          <w:color w:val="3B3B3B"/>
+          <w:kern w:val="0"/>
+          <w:sz w:val="20"/>
+          <w:szCs w:val="20"/>
         </w:rPr>
         <w:t>Sweep infrastructure:</w:t>
       </w:r>
@@ -1170,7 +1139,6 @@
           <w:kern w:val="0"/>
           <w:sz w:val="20"/>
           <w:szCs w:val="20"/>
-          <w14:ligatures w14:val="none"/>
         </w:rPr>
         <w:t> Rivanna/sweep code is good; reshape output into a </w:t>
       </w:r>
@@ -1183,7 +1151,6 @@
           <w:kern w:val="0"/>
           <w:sz w:val="20"/>
           <w:szCs w:val="20"/>
-          <w14:ligatures w14:val="none"/>
         </w:rPr>
         <w:t>standard slide series</w:t>
       </w:r>
@@ -1194,7 +1161,6 @@
           <w:kern w:val="0"/>
           <w:sz w:val="20"/>
           <w:szCs w:val="20"/>
-          <w14:ligatures w14:val="none"/>
         </w:rPr>
         <w:t> (equations at top, bold the knob, figures below) — not one-off PNGs.</w:t>
       </w:r>
@@ -1207,22 +1173,8 @@
           <w:kern w:val="0"/>
           <w:sz w:val="20"/>
           <w:szCs w:val="20"/>
-          <w14:ligatures w14:val="none"/>
-        </w:rPr>
-      </w:pPr>
-      <w:r>
-        <w:rPr>
-          <w:noProof/>
-        </w:rPr>
-      </w:r>
-      <w:r>
-        <w:pict w14:anchorId="7488D00B">
-          <v:rect id="Horizontal Line 10" o:spid="_x0000_s1030" style="width:540pt;height:.05pt;visibility:visible;mso-wrap-style:square;mso-left-percent:-10001;mso-top-percent:-10001;mso-position-horizontal:absolute;mso-position-horizontal-relative:char;mso-position-vertical:absolute;mso-position-vertical-relative:line;mso-left-percent:-10001;mso-top-percent:-10001;v-text-anchor:top" o:gfxdata="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" filled="f">
-            <o:lock v:ext="edit" rotation="t" aspectratio="t" verticies="t" text="t" shapetype="t"/>
-            <w10:anchorlock/>
-          </v:rect>
-        </w:pict>
-      </w:r>
+        </w:rPr>
+      </w:pPr>
     </w:p>
     <w:p>
       <w:pPr>
@@ -1237,7 +1189,6 @@
           <w:kern w:val="0"/>
           <w:sz w:val="32"/>
           <w:szCs w:val="32"/>
-          <w14:ligatures w14:val="none"/>
         </w:rPr>
       </w:pPr>
       <w:r>
@@ -1249,7 +1200,6 @@
           <w:kern w:val="0"/>
           <w:sz w:val="32"/>
           <w:szCs w:val="32"/>
-          <w14:ligatures w14:val="none"/>
         </w:rPr>
         <w:t>Three layers (don’t merge them)</w:t>
       </w:r>
@@ -1267,7 +1217,6 @@
           <w:kern w:val="0"/>
           <w:sz w:val="29"/>
           <w:szCs w:val="29"/>
-          <w14:ligatures w14:val="none"/>
         </w:rPr>
       </w:pPr>
       <w:r>
@@ -1279,7 +1228,6 @@
           <w:kern w:val="0"/>
           <w:sz w:val="29"/>
           <w:szCs w:val="29"/>
-          <w14:ligatures w14:val="none"/>
         </w:rPr>
         <w:t>Layer 1 — Gallery fixes (build on what you have)</w:t>
       </w:r>
@@ -1294,17 +1242,15 @@
           <w:kern w:val="0"/>
           <w:sz w:val="20"/>
           <w:szCs w:val="20"/>
-          <w14:ligatures w14:val="none"/>
-        </w:rPr>
-      </w:pPr>
-      <w:r>
-        <w:rPr>
-          <w:rFonts w:ascii="Arial" w:eastAsia="Times New Roman" w:hAnsi="Arial" w:cs="Arial"/>
-          <w:color w:val="3B3B3B"/>
-          <w:kern w:val="0"/>
-          <w:sz w:val="20"/>
-          <w:szCs w:val="20"/>
-          <w14:ligatures w14:val="none"/>
+        </w:rPr>
+      </w:pPr>
+      <w:r>
+        <w:rPr>
+          <w:rFonts w:ascii="Arial" w:eastAsia="Times New Roman" w:hAnsi="Arial" w:cs="Arial"/>
+          <w:color w:val="3B3B3B"/>
+          <w:kern w:val="0"/>
+          <w:sz w:val="20"/>
+          <w:szCs w:val="20"/>
         </w:rPr>
         <w:t>Concrete asks from looking at the deck:</w:t>
       </w:r>
@@ -1323,32 +1269,13 @@
           <w:kern w:val="0"/>
           <w:sz w:val="20"/>
           <w:szCs w:val="20"/>
-          <w14:ligatures w14:val="none"/>
-        </w:rPr>
-      </w:pPr>
-      <w:r>
-        <w:rPr>
-          <w:rFonts w:ascii="Arial" w:eastAsia="Times New Roman" w:hAnsi="Arial" w:cs="Arial"/>
-          <w:b/>
-          <w:bCs/>
-          <w:color w:val="3B3B3B"/>
-          <w:kern w:val="0"/>
-          <w:sz w:val="20"/>
-          <w:szCs w:val="20"/>
-          <w14:ligatures w14:val="none"/>
-        </w:rPr>
-        <w:t>λ ablation panel</w:t>
-      </w:r>
-      <w:r>
-        <w:rPr>
-          <w:rFonts w:ascii="Arial" w:eastAsia="Times New Roman" w:hAnsi="Arial" w:cs="Arial"/>
-          <w:color w:val="3B3B3B"/>
-          <w:kern w:val="0"/>
-          <w:sz w:val="20"/>
-          <w:szCs w:val="20"/>
-          <w14:ligatures w14:val="none"/>
-        </w:rPr>
-        <w:t> — mirror Pass C’s ρ panel: fix ρ, vary λ (e.g. four subplots at your four ρ values, or a fixed-ρ sweep).</w:t>
+        </w:rPr>
+      </w:pPr>
+      <w:r>
+        <w:rPr>
+          <w:rFonts w:cs="Aptos"/>
+        </w:rPr>
+        <w:t>λ ablation panel — mirror Pass C’s ρ panel: fix ρ, vary λ (e.g. four subplots at four λ values at one fixed ρ, same layout as Pass C).</w:t>
       </w:r>
     </w:p>
     <w:p>
@@ -1365,19 +1292,17 @@
           <w:kern w:val="0"/>
           <w:sz w:val="20"/>
           <w:szCs w:val="20"/>
-          <w14:ligatures w14:val="none"/>
-        </w:rPr>
-      </w:pPr>
-      <w:r>
-        <w:rPr>
-          <w:rFonts w:ascii="Arial" w:eastAsia="Times New Roman" w:hAnsi="Arial" w:cs="Arial"/>
-          <w:b/>
-          <w:bCs/>
-          <w:color w:val="3B3B3B"/>
-          <w:kern w:val="0"/>
-          <w:sz w:val="20"/>
-          <w:szCs w:val="20"/>
-          <w14:ligatures w14:val="none"/>
+        </w:rPr>
+      </w:pPr>
+      <w:r>
+        <w:rPr>
+          <w:rFonts w:ascii="Arial" w:eastAsia="Times New Roman" w:hAnsi="Arial" w:cs="Arial"/>
+          <w:b/>
+          <w:bCs/>
+          <w:color w:val="3B3B3B"/>
+          <w:kern w:val="0"/>
+          <w:sz w:val="20"/>
+          <w:szCs w:val="20"/>
         </w:rPr>
         <w:t>Double-plot in simulation</w:t>
       </w:r>
@@ -1388,7 +1313,6 @@
           <w:kern w:val="0"/>
           <w:sz w:val="20"/>
           <w:szCs w:val="20"/>
-          <w14:ligatures w14:val="none"/>
         </w:rPr>
         <w:t> — one run (e.g. λ = 0.55, ρ fixed):</w:t>
       </w:r>
@@ -1407,19 +1331,17 @@
           <w:kern w:val="0"/>
           <w:sz w:val="20"/>
           <w:szCs w:val="20"/>
-          <w14:ligatures w14:val="none"/>
-        </w:rPr>
-      </w:pPr>
-      <w:r>
-        <w:rPr>
-          <w:rFonts w:ascii="Arial" w:eastAsia="Times New Roman" w:hAnsi="Arial" w:cs="Arial"/>
-          <w:b/>
-          <w:bCs/>
-          <w:color w:val="3B3B3B"/>
-          <w:kern w:val="0"/>
-          <w:sz w:val="20"/>
-          <w:szCs w:val="20"/>
-          <w14:ligatures w14:val="none"/>
+        </w:rPr>
+      </w:pPr>
+      <w:r>
+        <w:rPr>
+          <w:rFonts w:ascii="Arial" w:eastAsia="Times New Roman" w:hAnsi="Arial" w:cs="Arial"/>
+          <w:b/>
+          <w:bCs/>
+          <w:color w:val="3B3B3B"/>
+          <w:kern w:val="0"/>
+          <w:sz w:val="20"/>
+          <w:szCs w:val="20"/>
         </w:rPr>
         <w:t>Left:</w:t>
       </w:r>
@@ -1430,7 +1352,6 @@
           <w:kern w:val="0"/>
           <w:sz w:val="20"/>
           <w:szCs w:val="20"/>
-          <w14:ligatures w14:val="none"/>
         </w:rPr>
         <w:t> 16 bins on </w:t>
       </w:r>
@@ -1443,7 +1364,6 @@
           <w:kern w:val="0"/>
           <w:sz w:val="20"/>
           <w:szCs w:val="20"/>
-          <w14:ligatures w14:val="none"/>
         </w:rPr>
         <w:t xml:space="preserve">individual </w:t>
       </w:r>
@@ -1505,7 +1425,6 @@
           <w:kern w:val="0"/>
           <w:sz w:val="20"/>
           <w:szCs w:val="20"/>
-          <w14:ligatures w14:val="none"/>
         </w:rPr>
         <w:t> (sort 1→n, then bin)</w:t>
       </w:r>
@@ -1524,19 +1443,17 @@
           <w:kern w:val="0"/>
           <w:sz w:val="20"/>
           <w:szCs w:val="20"/>
-          <w14:ligatures w14:val="none"/>
-        </w:rPr>
-      </w:pPr>
-      <w:r>
-        <w:rPr>
-          <w:rFonts w:ascii="Arial" w:eastAsia="Times New Roman" w:hAnsi="Arial" w:cs="Arial"/>
-          <w:b/>
-          <w:bCs/>
-          <w:color w:val="3B3B3B"/>
-          <w:kern w:val="0"/>
-          <w:sz w:val="20"/>
-          <w:szCs w:val="20"/>
-          <w14:ligatures w14:val="none"/>
+        </w:rPr>
+      </w:pPr>
+      <w:r>
+        <w:rPr>
+          <w:rFonts w:ascii="Arial" w:eastAsia="Times New Roman" w:hAnsi="Arial" w:cs="Arial"/>
+          <w:b/>
+          <w:bCs/>
+          <w:color w:val="3B3B3B"/>
+          <w:kern w:val="0"/>
+          <w:sz w:val="20"/>
+          <w:szCs w:val="20"/>
         </w:rPr>
         <w:t>Right:</w:t>
       </w:r>
@@ -1547,7 +1464,6 @@
           <w:kern w:val="0"/>
           <w:sz w:val="20"/>
           <w:szCs w:val="20"/>
-          <w14:ligatures w14:val="none"/>
         </w:rPr>
         <w:t> 16 bins on </w:t>
       </w:r>
@@ -1560,7 +1476,6 @@
           <w:kern w:val="0"/>
           <w:sz w:val="20"/>
           <w:szCs w:val="20"/>
-          <w14:ligatures w14:val="none"/>
         </w:rPr>
         <w:t>poolq_loo</w:t>
       </w:r>
@@ -1571,7 +1486,6 @@
           <w:kern w:val="0"/>
           <w:sz w:val="20"/>
           <w:szCs w:val="20"/>
-          <w14:ligatures w14:val="none"/>
         </w:rPr>
         <w:t> (team average talent, LOO)</w:t>
       </w:r>
@@ -1590,17 +1504,15 @@
           <w:kern w:val="0"/>
           <w:sz w:val="20"/>
           <w:szCs w:val="20"/>
-          <w14:ligatures w14:val="none"/>
-        </w:rPr>
-      </w:pPr>
-      <w:r>
-        <w:rPr>
-          <w:rFonts w:ascii="Arial" w:eastAsia="Times New Roman" w:hAnsi="Arial" w:cs="Arial"/>
-          <w:color w:val="3B3B3B"/>
-          <w:kern w:val="0"/>
-          <w:sz w:val="20"/>
-          <w:szCs w:val="20"/>
-          <w14:ligatures w14:val="none"/>
+        </w:rPr>
+      </w:pPr>
+      <w:r>
+        <w:rPr>
+          <w:rFonts w:ascii="Arial" w:eastAsia="Times New Roman" w:hAnsi="Arial" w:cs="Arial"/>
+          <w:color w:val="3B3B3B"/>
+          <w:kern w:val="0"/>
+          <w:sz w:val="20"/>
+          <w:szCs w:val="20"/>
         </w:rPr>
         <w:t>Same scenario both sides — not separate model runs with different λ.</w:t>
       </w:r>
@@ -1619,19 +1531,17 @@
           <w:kern w:val="0"/>
           <w:sz w:val="20"/>
           <w:szCs w:val="20"/>
-          <w14:ligatures w14:val="none"/>
-        </w:rPr>
-      </w:pPr>
-      <w:r>
-        <w:rPr>
-          <w:rFonts w:ascii="Arial" w:eastAsia="Times New Roman" w:hAnsi="Arial" w:cs="Arial"/>
-          <w:b/>
-          <w:bCs/>
-          <w:color w:val="3B3B3B"/>
-          <w:kern w:val="0"/>
-          <w:sz w:val="20"/>
-          <w:szCs w:val="20"/>
-          <w14:ligatures w14:val="none"/>
+        </w:rPr>
+      </w:pPr>
+      <w:r>
+        <w:rPr>
+          <w:rFonts w:ascii="Arial" w:eastAsia="Times New Roman" w:hAnsi="Arial" w:cs="Arial"/>
+          <w:b/>
+          <w:bCs/>
+          <w:color w:val="3B3B3B"/>
+          <w:kern w:val="0"/>
+          <w:sz w:val="20"/>
+          <w:szCs w:val="20"/>
         </w:rPr>
         <w:t>Overlay λ = 0 vs λ &gt; 0</w:t>
       </w:r>
@@ -1642,7 +1552,6 @@
           <w:kern w:val="0"/>
           <w:sz w:val="20"/>
           <w:szCs w:val="20"/>
-          <w14:ligatures w14:val="none"/>
         </w:rPr>
         <w:t> on the </w:t>
       </w:r>
@@ -1696,7 +1605,6 @@
           <w:kern w:val="0"/>
           <w:sz w:val="22"/>
           <w:szCs w:val="22"/>
-          <w14:ligatures w14:val="none"/>
         </w:rPr>
         <w:t>-</w:t>
       </w:r>
@@ -1709,7 +1617,6 @@
           <w:kern w:val="0"/>
           <w:sz w:val="20"/>
           <w:szCs w:val="20"/>
-          <w14:ligatures w14:val="none"/>
         </w:rPr>
         <w:t>binned</w:t>
       </w:r>
@@ -1720,7 +1627,6 @@
           <w:kern w:val="0"/>
           <w:sz w:val="20"/>
           <w:szCs w:val="20"/>
-          <w14:ligatures w14:val="none"/>
         </w:rPr>
         <w:t> side for deltas.</w:t>
       </w:r>
@@ -1739,19 +1645,17 @@
           <w:kern w:val="0"/>
           <w:sz w:val="20"/>
           <w:szCs w:val="20"/>
-          <w14:ligatures w14:val="none"/>
-        </w:rPr>
-      </w:pPr>
-      <w:r>
-        <w:rPr>
-          <w:rFonts w:ascii="Arial" w:eastAsia="Times New Roman" w:hAnsi="Arial" w:cs="Arial"/>
-          <w:b/>
-          <w:bCs/>
-          <w:color w:val="3B3B3B"/>
-          <w:kern w:val="0"/>
-          <w:sz w:val="20"/>
-          <w:szCs w:val="20"/>
-          <w14:ligatures w14:val="none"/>
+        </w:rPr>
+      </w:pPr>
+      <w:r>
+        <w:rPr>
+          <w:rFonts w:ascii="Arial" w:eastAsia="Times New Roman" w:hAnsi="Arial" w:cs="Arial"/>
+          <w:b/>
+          <w:bCs/>
+          <w:color w:val="3B3B3B"/>
+          <w:kern w:val="0"/>
+          <w:sz w:val="20"/>
+          <w:szCs w:val="20"/>
         </w:rPr>
         <w:t>Put sort-and-chop back</w:t>
       </w:r>
@@ -1762,7 +1666,6 @@
           <w:kern w:val="0"/>
           <w:sz w:val="20"/>
           <w:szCs w:val="20"/>
-          <w14:ligatures w14:val="none"/>
         </w:rPr>
         <w:t> on the Pass C ρ figure (you cut it because it squished the panel).</w:t>
       </w:r>
@@ -1781,19 +1684,17 @@
           <w:kern w:val="0"/>
           <w:sz w:val="20"/>
           <w:szCs w:val="20"/>
-          <w14:ligatures w14:val="none"/>
-        </w:rPr>
-      </w:pPr>
-      <w:r>
-        <w:rPr>
-          <w:rFonts w:ascii="Arial" w:eastAsia="Times New Roman" w:hAnsi="Arial" w:cs="Arial"/>
-          <w:b/>
-          <w:bCs/>
-          <w:color w:val="3B3B3B"/>
-          <w:kern w:val="0"/>
-          <w:sz w:val="20"/>
-          <w:szCs w:val="20"/>
-          <w14:ligatures w14:val="none"/>
+        </w:rPr>
+      </w:pPr>
+      <w:r>
+        <w:rPr>
+          <w:rFonts w:ascii="Arial" w:eastAsia="Times New Roman" w:hAnsi="Arial" w:cs="Arial"/>
+          <w:b/>
+          <w:bCs/>
+          <w:color w:val="3B3B3B"/>
+          <w:kern w:val="0"/>
+          <w:sz w:val="20"/>
+          <w:szCs w:val="20"/>
         </w:rPr>
         <w:t>Report fitted inputs:</w:t>
       </w:r>
@@ -1804,7 +1705,6 @@
           <w:kern w:val="0"/>
           <w:sz w:val="20"/>
           <w:szCs w:val="20"/>
-          <w14:ligatures w14:val="none"/>
         </w:rPr>
         <w:t> distribution of </w:t>
       </w:r>
@@ -1866,7 +1766,6 @@
           <w:kern w:val="0"/>
           <w:sz w:val="20"/>
           <w:szCs w:val="20"/>
-          <w14:ligatures w14:val="none"/>
         </w:rPr>
         <w:t>, </w:t>
       </w:r>
@@ -1879,7 +1778,6 @@
           <w:kern w:val="0"/>
           <w:sz w:val="20"/>
           <w:szCs w:val="20"/>
-          <w14:ligatures w14:val="none"/>
         </w:rPr>
         <w:t>σ²</w:t>
       </w:r>
@@ -1890,7 +1788,6 @@
           <w:kern w:val="0"/>
           <w:sz w:val="20"/>
           <w:szCs w:val="20"/>
-          <w14:ligatures w14:val="none"/>
         </w:rPr>
         <w:t>, etc. — notation that </w:t>
       </w:r>
@@ -1903,7 +1800,6 @@
           <w:kern w:val="0"/>
           <w:sz w:val="20"/>
           <w:szCs w:val="20"/>
-          <w14:ligatures w14:val="none"/>
         </w:rPr>
         <w:t>data-fitted</w:t>
       </w:r>
@@ -1914,7 +1810,6 @@
           <w:kern w:val="0"/>
           <w:sz w:val="20"/>
           <w:szCs w:val="20"/>
-          <w14:ligatures w14:val="none"/>
         </w:rPr>
         <w:t> quantities (t̃, empirical draws) differ from </w:t>
       </w:r>
@@ -1927,7 +1822,6 @@
           <w:kern w:val="0"/>
           <w:sz w:val="20"/>
           <w:szCs w:val="20"/>
-          <w14:ligatures w14:val="none"/>
         </w:rPr>
         <w:t>simulation-drawn</w:t>
       </w:r>
@@ -1938,7 +1832,6 @@
           <w:kern w:val="0"/>
           <w:sz w:val="20"/>
           <w:szCs w:val="20"/>
-          <w14:ligatures w14:val="none"/>
         </w:rPr>
         <w:t> ones.</w:t>
       </w:r>
@@ -1953,19 +1846,14 @@
           <w:kern w:val="0"/>
           <w:sz w:val="20"/>
           <w:szCs w:val="20"/>
-          <w14:ligatures w14:val="none"/>
-        </w:rPr>
-      </w:pPr>
-      <w:r>
-        <w:rPr>
-          <w:rFonts w:ascii="Arial" w:eastAsia="Times New Roman" w:hAnsi="Arial" w:cs="Arial"/>
-          <w:color w:val="3B3B3B"/>
-          <w:kern w:val="0"/>
-          <w:sz w:val="20"/>
-          <w:szCs w:val="20"/>
-          <w14:ligatures w14:val="none"/>
-        </w:rPr>
-        <w:t>Alex called these “puzzle pieces” — important, but not the deepest insight.</w:t>
+        </w:rPr>
+      </w:pPr>
+      <w:r>
+        <w:rPr>
+          <w:rFonts w:cs="Aptos"/>
+        </w:rPr>
+        <w:lastRenderedPageBreak/>
+        <w:t>Alex called these “puzzle pieces” — important, but not the deepest insight. Phase A (below) is the quick gallery pass; Phase B is the same logic turned into a full one-slide-per-knob characterization deck.</w:t>
       </w:r>
     </w:p>
     <w:p>
@@ -1981,7 +1869,6 @@
           <w:kern w:val="0"/>
           <w:sz w:val="29"/>
           <w:szCs w:val="29"/>
-          <w14:ligatures w14:val="none"/>
         </w:rPr>
       </w:pPr>
       <w:r>
@@ -1993,9 +1880,7 @@
           <w:kern w:val="0"/>
           <w:sz w:val="29"/>
           <w:szCs w:val="29"/>
-          <w14:ligatures w14:val="none"/>
-        </w:rPr>
-        <w:lastRenderedPageBreak/>
+        </w:rPr>
         <w:t>Layer 2 — Main mission now: sensitivity characterization (~4 days)</w:t>
       </w:r>
     </w:p>
@@ -2008,16 +1893,14 @@
           <w:kern w:val="0"/>
           <w:sz w:val="20"/>
           <w:szCs w:val="20"/>
-          <w14:ligatures w14:val="none"/>
-        </w:rPr>
-      </w:pPr>
-      <w:r>
-        <w:rPr>
-          <w:rFonts w:ascii="Arial" w:eastAsia="Times New Roman" w:hAnsi="Arial" w:cs="Arial"/>
-          <w:kern w:val="0"/>
-          <w:sz w:val="20"/>
-          <w:szCs w:val="20"/>
-          <w14:ligatures w14:val="none"/>
+        </w:rPr>
+      </w:pPr>
+      <w:r>
+        <w:rPr>
+          <w:rFonts w:ascii="Arial" w:eastAsia="Times New Roman" w:hAnsi="Arial" w:cs="Arial"/>
+          <w:kern w:val="0"/>
+          <w:sz w:val="20"/>
+          <w:szCs w:val="20"/>
         </w:rPr>
         <w:t>Vary </w:t>
       </w:r>
@@ -2029,7 +1912,6 @@
           <w:kern w:val="0"/>
           <w:sz w:val="20"/>
           <w:szCs w:val="20"/>
-          <w14:ligatures w14:val="none"/>
         </w:rPr>
         <w:t>one knob at a time</w:t>
       </w:r>
@@ -2039,7 +1921,6 @@
           <w:kern w:val="0"/>
           <w:sz w:val="20"/>
           <w:szCs w:val="20"/>
-          <w14:ligatures w14:val="none"/>
         </w:rPr>
         <w:t>; keep everything else fixed; show how the </w:t>
       </w:r>
@@ -2051,7 +1932,6 @@
           <w:kern w:val="0"/>
           <w:sz w:val="20"/>
           <w:szCs w:val="20"/>
-          <w14:ligatures w14:val="none"/>
         </w:rPr>
         <w:t>two curves</w:t>
       </w:r>
@@ -2061,7 +1941,6 @@
           <w:kern w:val="0"/>
           <w:sz w:val="20"/>
           <w:szCs w:val="20"/>
-          <w14:ligatures w14:val="none"/>
         </w:rPr>
         <w:t> move.</w:t>
       </w:r>
@@ -2076,19 +1955,17 @@
           <w:kern w:val="0"/>
           <w:sz w:val="20"/>
           <w:szCs w:val="20"/>
-          <w14:ligatures w14:val="none"/>
-        </w:rPr>
-      </w:pPr>
-      <w:r>
-        <w:rPr>
-          <w:rFonts w:ascii="Arial" w:eastAsia="Times New Roman" w:hAnsi="Arial" w:cs="Arial"/>
-          <w:b/>
-          <w:bCs/>
-          <w:color w:val="3B3B3B"/>
-          <w:kern w:val="0"/>
-          <w:sz w:val="20"/>
-          <w:szCs w:val="20"/>
-          <w14:ligatures w14:val="none"/>
+        </w:rPr>
+      </w:pPr>
+      <w:r>
+        <w:rPr>
+          <w:rFonts w:ascii="Arial" w:eastAsia="Times New Roman" w:hAnsi="Arial" w:cs="Arial"/>
+          <w:b/>
+          <w:bCs/>
+          <w:color w:val="3B3B3B"/>
+          <w:kern w:val="0"/>
+          <w:sz w:val="20"/>
+          <w:szCs w:val="20"/>
         </w:rPr>
         <w:t>The two curves</w:t>
       </w:r>
@@ -2099,7 +1976,6 @@
           <w:kern w:val="0"/>
           <w:sz w:val="20"/>
           <w:szCs w:val="20"/>
-          <w14:ligatures w14:val="none"/>
         </w:rPr>
         <w:t> (throughout the meeting):</w:t>
       </w:r>
@@ -2118,17 +1994,15 @@
           <w:kern w:val="0"/>
           <w:sz w:val="20"/>
           <w:szCs w:val="20"/>
-          <w14:ligatures w14:val="none"/>
-        </w:rPr>
-      </w:pPr>
-      <w:r>
-        <w:rPr>
-          <w:rFonts w:ascii="Arial" w:eastAsia="Times New Roman" w:hAnsi="Arial" w:cs="Arial"/>
-          <w:color w:val="3B3B3B"/>
-          <w:kern w:val="0"/>
-          <w:sz w:val="20"/>
-          <w:szCs w:val="20"/>
-          <w14:ligatures w14:val="none"/>
+        </w:rPr>
+      </w:pPr>
+      <w:r>
+        <w:rPr>
+          <w:rFonts w:ascii="Arial" w:eastAsia="Times New Roman" w:hAnsi="Arial" w:cs="Arial"/>
+          <w:color w:val="3B3B3B"/>
+          <w:kern w:val="0"/>
+          <w:sz w:val="20"/>
+          <w:szCs w:val="20"/>
         </w:rPr>
         <w:t>binned by </w:t>
       </w:r>
@@ -2194,7 +2068,6 @@
           <w:sz w:val="20"/>
           <w:szCs w:val="20"/>
           <w:vertAlign w:val="subscript"/>
-          <w14:ligatures w14:val="none"/>
         </w:rPr>
         <w:t> </w:t>
       </w:r>
@@ -2205,7 +2078,6 @@
           <w:kern w:val="0"/>
           <w:sz w:val="20"/>
           <w:szCs w:val="20"/>
-          <w14:ligatures w14:val="none"/>
         </w:rPr>
         <w:t>→ monotone talent ladder</w:t>
       </w:r>
@@ -2224,17 +2096,15 @@
           <w:kern w:val="0"/>
           <w:sz w:val="20"/>
           <w:szCs w:val="20"/>
-          <w14:ligatures w14:val="none"/>
-        </w:rPr>
-      </w:pPr>
-      <w:r>
-        <w:rPr>
-          <w:rFonts w:ascii="Arial" w:eastAsia="Times New Roman" w:hAnsi="Arial" w:cs="Arial"/>
-          <w:color w:val="3B3B3B"/>
-          <w:kern w:val="0"/>
-          <w:sz w:val="20"/>
-          <w:szCs w:val="20"/>
-          <w14:ligatures w14:val="none"/>
+        </w:rPr>
+      </w:pPr>
+      <w:r>
+        <w:rPr>
+          <w:rFonts w:ascii="Arial" w:eastAsia="Times New Roman" w:hAnsi="Arial" w:cs="Arial"/>
+          <w:color w:val="3B3B3B"/>
+          <w:kern w:val="0"/>
+          <w:sz w:val="20"/>
+          <w:szCs w:val="20"/>
         </w:rPr>
         <w:t>binned by </w:t>
       </w:r>
@@ -2247,7 +2117,6 @@
           <w:kern w:val="0"/>
           <w:sz w:val="20"/>
           <w:szCs w:val="20"/>
-          <w14:ligatures w14:val="none"/>
         </w:rPr>
         <w:t xml:space="preserve">poolq_loo / </w:t>
       </w:r>
@@ -2309,13 +2178,179 @@
           <w:kern w:val="0"/>
           <w:sz w:val="20"/>
           <w:szCs w:val="20"/>
-          <w14:ligatures w14:val="none"/>
         </w:rPr>
         <w:t> → inverted-U / roster-pressure shape</w:t>
       </w:r>
     </w:p>
     <w:p>
       <w:pPr>
+        <w:pStyle w:val="Heading2"/>
+      </w:pPr>
+      <w:r>
+        <w:rPr>
+          <w:rFonts w:cs="Aptos Display"/>
+        </w:rPr>
+        <w:t>What Alex means by “characterize”</w:t>
+      </w:r>
+    </w:p>
+    <w:p>
+      <w:r>
+        <w:rPr>
+          <w:rFonts w:cs="Aptos"/>
+        </w:rPr>
+        <w:t>One sentence: characterize = for each model knob, run a disciplined sensitivity study in the simulator—hold everything else fixed, sweep that knob, and show how the two outcome curves move—so you can say what matters, what barely matters, and what the knob does in this framework. It is not (yet) “pick the knob value that makes the sim match the empirical Hero plot.”</w:t>
+      </w:r>
+    </w:p>
+    <w:p>
+      <w:pPr>
+        <w:pStyle w:val="Heading3"/>
+      </w:pPr>
+      <w:r>
+        <w:rPr>
+          <w:rFonts w:cs="Aptos"/>
+        </w:rPr>
+        <w:t>What it is</w:t>
+      </w:r>
+    </w:p>
+    <w:p>
+      <w:r>
+        <w:rPr>
+          <w:rFonts w:cs="Aptos"/>
+        </w:rPr>
+        <w:t xml:space="preserve">Each slide answers: “If I change only this parameter, what happens to the model’s behavior?” Fix all other settings to the baseline (539 preset, etc.). Sweep one knob across a sensible range. Plot both curves from the same sim run(s). Interpret: does the inverted-U appear or vanish? Does the monotone </w:t>
+      </w:r>
+      <w:proofErr w:type="spellStart"/>
+      <w:r>
+        <w:rPr>
+          <w:rFonts w:cs="Aptos"/>
+        </w:rPr>
+        <w:t>A_i</w:t>
+      </w:r>
+      <w:proofErr w:type="spellEnd"/>
+      <w:r>
+        <w:rPr>
+          <w:rFonts w:cs="Aptos"/>
+        </w:rPr>
+        <w:t xml:space="preserve"> ladder change? Does anything move at all?</w:t>
+      </w:r>
+    </w:p>
+    <w:p>
+      <w:pPr>
+        <w:pStyle w:val="Heading3"/>
+      </w:pPr>
+      <w:r>
+        <w:rPr>
+          <w:rFonts w:cs="Aptos"/>
+        </w:rPr>
+        <w:t>What it is not</w:t>
+      </w:r>
+    </w:p>
+    <w:p>
+      <w:r>
+        <w:rPr>
+          <w:rFonts w:cs="Aptos"/>
+        </w:rPr>
+        <w:t>• Curve fitting — tuning ρ or λ until the sim tracks the empirical Hero curve (minimizing curve distance).</w:t>
+      </w:r>
+    </w:p>
+    <w:p>
+      <w:r>
+        <w:rPr>
+          <w:rFonts w:cs="Aptos"/>
+        </w:rPr>
+        <w:t>• Statistical fitting to real data — Layer 3 / Phase C; Alex at ~41:44: not caring about fitting to data yet.</w:t>
+      </w:r>
+    </w:p>
+    <w:p>
+      <w:r>
+        <w:rPr>
+          <w:rFonts w:cs="Aptos"/>
+        </w:rPr>
+        <w:t>• Ad hoc PNGs without the standard slide template (three equations, bold knob, figures below).</w:t>
+      </w:r>
+    </w:p>
+    <w:p>
+      <w:r>
+        <w:rPr>
+          <w:rFonts w:cs="Aptos"/>
+        </w:rPr>
+        <w:t>• Changing multiple knobs at once without an explicit design (default: one knob per slide).</w:t>
+      </w:r>
+    </w:p>
+    <w:p>
+      <w:pPr>
+        <w:pStyle w:val="Heading3"/>
+      </w:pPr>
+      <w:r>
+        <w:rPr>
+          <w:rFonts w:cs="Aptos"/>
+        </w:rPr>
+        <w:t>Characterize (now) vs fit (later)</w:t>
+      </w:r>
+    </w:p>
+    <w:p>
+      <w:r>
+        <w:rPr>
+          <w:rFonts w:cs="Aptos"/>
+        </w:rPr>
+        <w:t>Now, in the sim — characterize: “What does this knob do?” Sensitivity plots, qualitative claims, which knobs are worth calibrating.</w:t>
+      </w:r>
+    </w:p>
+    <w:p>
+      <w:r>
+        <w:rPr>
+          <w:rFonts w:cs="Aptos"/>
+        </w:rPr>
+        <w:t>Later, on real data — fit: “What value does the data imply?” Estimators tied to defined statistics (e.g. within-team correlation for ρ; a roster-pressure statistic for λ), not Hero curve overlay.</w:t>
+      </w:r>
+    </w:p>
+    <w:p>
+      <w:pPr>
+        <w:pStyle w:val="Heading3"/>
+      </w:pPr>
+      <w:r>
+        <w:rPr>
+          <w:rFonts w:cs="Aptos"/>
+        </w:rPr>
+        <w:t>Done with a knob when</w:t>
+      </w:r>
+    </w:p>
+    <w:p>
+      <w:r>
+        <w:rPr>
+          <w:rFonts w:cs="Aptos"/>
+        </w:rPr>
+        <w:t>You can tell Alex, for that slide: (1) what you held fixed, (2) what you varied, (3) what happened to both curves, and (4) whether the knob is essential, nice-to-have, probably robust, or system-dependent (e.g. K/N). A Rivanna sweep alone is not characterization until it is shaped into that slide + interpretation.</w:t>
+      </w:r>
+    </w:p>
+    <w:p>
+      <w:pPr>
+        <w:pStyle w:val="Heading3"/>
+      </w:pPr>
+      <w:r>
+        <w:rPr>
+          <w:rFonts w:cs="Aptos"/>
+        </w:rPr>
+        <w:t>OAT caveat (interactions)</w:t>
+      </w:r>
+    </w:p>
+    <w:p>
+      <w:r>
+        <w:rPr>
+          <w:rFonts w:cs="Aptos"/>
+        </w:rPr>
+        <w:t xml:space="preserve">OAT caveat (interactions): One knob alone might never produce the Hero-style curve; ρ and λ (for example) may be necessary together. Alex’s one-at-a-time plan maps each knob around a working </w:t>
+      </w:r>
+      <w:r>
+        <w:rPr>
+          <w:rFonts w:cs="Aptos"/>
+        </w:rPr>
+        <w:lastRenderedPageBreak/>
+        <w:t>baseline (539 preset)—not rediscover the inverted-U from zero. If ρ or λ marginal sweeps look flat, check baseline and consider a small ρ × λ panel at the checkpoint with Alex; Pass A remains the empirical anchor.</w:t>
+      </w:r>
+    </w:p>
+    <w:p>
+      <w:pPr>
         <w:shd w:val="clear" w:color="auto" w:fill="FFFFFF"/>
         <w:spacing w:before="150" w:after="150" w:line="240" w:lineRule="auto"/>
         <w:rPr>
@@ -2324,19 +2359,17 @@
           <w:kern w:val="0"/>
           <w:sz w:val="20"/>
           <w:szCs w:val="20"/>
-          <w14:ligatures w14:val="none"/>
-        </w:rPr>
-      </w:pPr>
-      <w:r>
-        <w:rPr>
-          <w:rFonts w:ascii="Arial" w:eastAsia="Times New Roman" w:hAnsi="Arial" w:cs="Arial"/>
-          <w:b/>
-          <w:bCs/>
-          <w:color w:val="3B3B3B"/>
-          <w:kern w:val="0"/>
-          <w:sz w:val="20"/>
-          <w:szCs w:val="20"/>
-          <w14:ligatures w14:val="none"/>
+        </w:rPr>
+      </w:pPr>
+      <w:r>
+        <w:rPr>
+          <w:rFonts w:ascii="Arial" w:eastAsia="Times New Roman" w:hAnsi="Arial" w:cs="Arial"/>
+          <w:b/>
+          <w:bCs/>
+          <w:color w:val="3B3B3B"/>
+          <w:kern w:val="0"/>
+          <w:sz w:val="20"/>
+          <w:szCs w:val="20"/>
         </w:rPr>
         <w:t>Knobs to characterize</w:t>
       </w:r>
@@ -2347,7 +2380,6 @@
           <w:kern w:val="0"/>
           <w:sz w:val="20"/>
           <w:szCs w:val="20"/>
-          <w14:ligatures w14:val="none"/>
         </w:rPr>
         <w:t> (one slide each: 3 core equations, </w:t>
       </w:r>
@@ -2360,7 +2392,6 @@
           <w:kern w:val="0"/>
           <w:sz w:val="20"/>
           <w:szCs w:val="20"/>
-          <w14:ligatures w14:val="none"/>
         </w:rPr>
         <w:t>bold the knob</w:t>
       </w:r>
@@ -2371,7 +2402,6 @@
           <w:kern w:val="0"/>
           <w:sz w:val="20"/>
           <w:szCs w:val="20"/>
-          <w14:ligatures w14:val="none"/>
         </w:rPr>
         <w:t>, figure below):</w:t>
       </w:r>
@@ -2379,17 +2409,25 @@
     <w:tbl>
       <w:tblPr>
         <w:tblW w:w="0" w:type="auto"/>
+        <w:tblBorders>
+          <w:top w:val="single" w:sz="4" w:space="0" w:color="auto"/>
+          <w:left w:val="single" w:sz="4" w:space="0" w:color="auto"/>
+          <w:bottom w:val="single" w:sz="4" w:space="0" w:color="auto"/>
+          <w:right w:val="single" w:sz="4" w:space="0" w:color="auto"/>
+          <w:insideH w:val="single" w:sz="4" w:space="0" w:color="auto"/>
+          <w:insideV w:val="single" w:sz="4" w:space="0" w:color="auto"/>
+        </w:tblBorders>
         <w:tblCellMar>
           <w:top w:w="15" w:type="dxa"/>
           <w:left w:w="15" w:type="dxa"/>
           <w:bottom w:w="15" w:type="dxa"/>
           <w:right w:w="15" w:type="dxa"/>
         </w:tblCellMar>
-        <w:tblLook w:val="04A0" w:firstRow="1" w:lastRow="0" w:firstColumn="1" w:lastColumn="0" w:noHBand="0" w:noVBand="1"/>
+        <w:tblLook w:val="07E0" w:firstRow="1" w:lastRow="1" w:firstColumn="1" w:lastColumn="1" w:noHBand="1" w:noVBand="1"/>
       </w:tblPr>
       <w:tblGrid>
-        <w:gridCol w:w="2130"/>
-        <w:gridCol w:w="8670"/>
+        <w:gridCol w:w="2335"/>
+        <w:gridCol w:w="8455"/>
       </w:tblGrid>
       <w:tr>
         <w:trPr>
@@ -2397,7 +2435,13 @@
         </w:trPr>
         <w:tc>
           <w:tcPr>
-            <w:tcW w:w="0" w:type="auto"/>
+            <w:tcW w:w="2335" w:type="dxa"/>
+            <w:tcBorders>
+              <w:top w:val="single" w:sz="4" w:space="0" w:color="auto"/>
+              <w:left w:val="single" w:sz="4" w:space="0" w:color="auto"/>
+              <w:bottom w:val="single" w:sz="4" w:space="0" w:color="auto"/>
+              <w:right w:val="single" w:sz="4" w:space="0" w:color="auto"/>
+            </w:tcBorders>
             <w:noWrap/>
             <w:tcMar>
               <w:top w:w="75" w:type="dxa"/>
@@ -2415,7 +2459,6 @@
                 <w:b/>
                 <w:bCs/>
                 <w:kern w:val="0"/>
-                <w14:ligatures w14:val="none"/>
               </w:rPr>
             </w:pPr>
             <w:r>
@@ -2424,7 +2467,6 @@
                 <w:b/>
                 <w:bCs/>
                 <w:kern w:val="0"/>
-                <w14:ligatures w14:val="none"/>
               </w:rPr>
               <w:t>Knob</w:t>
             </w:r>
@@ -2432,7 +2474,13 @@
         </w:tc>
         <w:tc>
           <w:tcPr>
-            <w:tcW w:w="0" w:type="auto"/>
+            <w:tcW w:w="8455" w:type="dxa"/>
+            <w:tcBorders>
+              <w:top w:val="single" w:sz="4" w:space="0" w:color="auto"/>
+              <w:left w:val="single" w:sz="4" w:space="0" w:color="auto"/>
+              <w:bottom w:val="single" w:sz="4" w:space="0" w:color="auto"/>
+              <w:right w:val="single" w:sz="4" w:space="0" w:color="auto"/>
+            </w:tcBorders>
             <w:noWrap/>
             <w:tcMar>
               <w:top w:w="75" w:type="dxa"/>
@@ -2450,7 +2498,6 @@
                 <w:b/>
                 <w:bCs/>
                 <w:kern w:val="0"/>
-                <w14:ligatures w14:val="none"/>
               </w:rPr>
             </w:pPr>
             <w:r>
@@ -2459,7 +2506,6 @@
                 <w:b/>
                 <w:bCs/>
                 <w:kern w:val="0"/>
-                <w14:ligatures w14:val="none"/>
               </w:rPr>
               <w:t>Alex’s expectation</w:t>
             </w:r>
@@ -2469,7 +2515,13 @@
       <w:tr>
         <w:tc>
           <w:tcPr>
-            <w:tcW w:w="0" w:type="auto"/>
+            <w:tcW w:w="2335" w:type="dxa"/>
+            <w:tcBorders>
+              <w:top w:val="single" w:sz="4" w:space="0" w:color="auto"/>
+              <w:left w:val="single" w:sz="4" w:space="0" w:color="auto"/>
+              <w:bottom w:val="single" w:sz="4" w:space="0" w:color="auto"/>
+              <w:right w:val="single" w:sz="4" w:space="0" w:color="auto"/>
+            </w:tcBorders>
             <w:tcMar>
               <w:top w:w="75" w:type="dxa"/>
               <w:left w:w="135" w:type="dxa"/>
@@ -2484,7 +2536,6 @@
               <w:rPr>
                 <w:rFonts w:ascii="Times New Roman" w:eastAsia="Times New Roman" w:hAnsi="Times New Roman" w:cs="Times New Roman"/>
                 <w:kern w:val="0"/>
-                <w14:ligatures w14:val="none"/>
               </w:rPr>
             </w:pPr>
             <w:r>
@@ -2493,7 +2544,6 @@
                 <w:b/>
                 <w:bCs/>
                 <w:kern w:val="0"/>
-                <w14:ligatures w14:val="none"/>
               </w:rPr>
               <w:t>ρ</w:t>
             </w:r>
@@ -2501,7 +2551,13 @@
         </w:tc>
         <w:tc>
           <w:tcPr>
-            <w:tcW w:w="0" w:type="auto"/>
+            <w:tcW w:w="8455" w:type="dxa"/>
+            <w:tcBorders>
+              <w:top w:val="single" w:sz="4" w:space="0" w:color="auto"/>
+              <w:left w:val="single" w:sz="4" w:space="0" w:color="auto"/>
+              <w:bottom w:val="single" w:sz="4" w:space="0" w:color="auto"/>
+              <w:right w:val="single" w:sz="4" w:space="0" w:color="auto"/>
+            </w:tcBorders>
             <w:tcMar>
               <w:top w:w="75" w:type="dxa"/>
               <w:left w:w="135" w:type="dxa"/>
@@ -2516,14 +2572,12 @@
               <w:rPr>
                 <w:rFonts w:ascii="Times New Roman" w:eastAsia="Times New Roman" w:hAnsi="Times New Roman" w:cs="Times New Roman"/>
                 <w:kern w:val="0"/>
-                <w14:ligatures w14:val="none"/>
               </w:rPr>
             </w:pPr>
             <w:r>
               <w:rPr>
                 <w:rFonts w:ascii="Times New Roman" w:eastAsia="Times New Roman" w:hAnsi="Times New Roman" w:cs="Times New Roman"/>
                 <w:kern w:val="0"/>
-                <w14:ligatures w14:val="none"/>
               </w:rPr>
               <w:t>Matters a lot (Pass C shows this)</w:t>
             </w:r>
@@ -2533,7 +2587,13 @@
       <w:tr>
         <w:tc>
           <w:tcPr>
-            <w:tcW w:w="0" w:type="auto"/>
+            <w:tcW w:w="2335" w:type="dxa"/>
+            <w:tcBorders>
+              <w:top w:val="single" w:sz="4" w:space="0" w:color="auto"/>
+              <w:left w:val="single" w:sz="4" w:space="0" w:color="auto"/>
+              <w:bottom w:val="single" w:sz="4" w:space="0" w:color="auto"/>
+              <w:right w:val="single" w:sz="4" w:space="0" w:color="auto"/>
+            </w:tcBorders>
             <w:tcMar>
               <w:top w:w="75" w:type="dxa"/>
               <w:left w:w="135" w:type="dxa"/>
@@ -2548,7 +2608,6 @@
               <w:rPr>
                 <w:rFonts w:ascii="Times New Roman" w:eastAsia="Times New Roman" w:hAnsi="Times New Roman" w:cs="Times New Roman"/>
                 <w:kern w:val="0"/>
-                <w14:ligatures w14:val="none"/>
               </w:rPr>
             </w:pPr>
             <w:r>
@@ -2557,7 +2616,6 @@
                 <w:b/>
                 <w:bCs/>
                 <w:kern w:val="0"/>
-                <w14:ligatures w14:val="none"/>
               </w:rPr>
               <w:t>λ</w:t>
             </w:r>
@@ -2565,7 +2623,13 @@
         </w:tc>
         <w:tc>
           <w:tcPr>
-            <w:tcW w:w="0" w:type="auto"/>
+            <w:tcW w:w="8455" w:type="dxa"/>
+            <w:tcBorders>
+              <w:top w:val="single" w:sz="4" w:space="0" w:color="auto"/>
+              <w:left w:val="single" w:sz="4" w:space="0" w:color="auto"/>
+              <w:bottom w:val="single" w:sz="4" w:space="0" w:color="auto"/>
+              <w:right w:val="single" w:sz="4" w:space="0" w:color="auto"/>
+            </w:tcBorders>
             <w:tcMar>
               <w:top w:w="75" w:type="dxa"/>
               <w:left w:w="135" w:type="dxa"/>
@@ -2580,14 +2644,12 @@
               <w:rPr>
                 <w:rFonts w:ascii="Times New Roman" w:eastAsia="Times New Roman" w:hAnsi="Times New Roman" w:cs="Times New Roman"/>
                 <w:kern w:val="0"/>
-                <w14:ligatures w14:val="none"/>
               </w:rPr>
             </w:pPr>
             <w:r>
               <w:rPr>
                 <w:rFonts w:ascii="Times New Roman" w:eastAsia="Times New Roman" w:hAnsi="Times New Roman" w:cs="Times New Roman"/>
                 <w:kern w:val="0"/>
-                <w14:ligatures w14:val="none"/>
               </w:rPr>
               <w:t>Matters a lot (Pass B starts it; needs full panel)</w:t>
             </w:r>
@@ -2597,7 +2659,13 @@
       <w:tr>
         <w:tc>
           <w:tcPr>
-            <w:tcW w:w="0" w:type="auto"/>
+            <w:tcW w:w="2335" w:type="dxa"/>
+            <w:tcBorders>
+              <w:top w:val="single" w:sz="4" w:space="0" w:color="auto"/>
+              <w:left w:val="single" w:sz="4" w:space="0" w:color="auto"/>
+              <w:bottom w:val="single" w:sz="4" w:space="0" w:color="auto"/>
+              <w:right w:val="single" w:sz="4" w:space="0" w:color="auto"/>
+            </w:tcBorders>
             <w:tcMar>
               <w:top w:w="75" w:type="dxa"/>
               <w:left w:w="135" w:type="dxa"/>
@@ -2612,7 +2680,6 @@
               <w:rPr>
                 <w:rFonts w:ascii="Times New Roman" w:eastAsia="Times New Roman" w:hAnsi="Times New Roman" w:cs="Times New Roman"/>
                 <w:kern w:val="0"/>
-                <w14:ligatures w14:val="none"/>
               </w:rPr>
             </w:pPr>
             <w:r>
@@ -2621,7 +2688,6 @@
                 <w:b/>
                 <w:bCs/>
                 <w:kern w:val="0"/>
-                <w14:ligatures w14:val="none"/>
               </w:rPr>
               <w:t>θ</w:t>
             </w:r>
@@ -2629,7 +2695,6 @@
               <w:rPr>
                 <w:rFonts w:ascii="Times New Roman" w:eastAsia="Times New Roman" w:hAnsi="Times New Roman" w:cs="Times New Roman"/>
                 <w:kern w:val="0"/>
-                <w14:ligatures w14:val="none"/>
               </w:rPr>
               <w:t> (sigmoid center)</w:t>
             </w:r>
@@ -2637,7 +2702,13 @@
         </w:tc>
         <w:tc>
           <w:tcPr>
-            <w:tcW w:w="0" w:type="auto"/>
+            <w:tcW w:w="8455" w:type="dxa"/>
+            <w:tcBorders>
+              <w:top w:val="single" w:sz="4" w:space="0" w:color="auto"/>
+              <w:left w:val="single" w:sz="4" w:space="0" w:color="auto"/>
+              <w:bottom w:val="single" w:sz="4" w:space="0" w:color="auto"/>
+              <w:right w:val="single" w:sz="4" w:space="0" w:color="auto"/>
+            </w:tcBorders>
             <w:tcMar>
               <w:top w:w="75" w:type="dxa"/>
               <w:left w:w="135" w:type="dxa"/>
@@ -2652,14 +2723,12 @@
               <w:rPr>
                 <w:rFonts w:ascii="Times New Roman" w:eastAsia="Times New Roman" w:hAnsi="Times New Roman" w:cs="Times New Roman"/>
                 <w:kern w:val="0"/>
-                <w14:ligatures w14:val="none"/>
               </w:rPr>
             </w:pPr>
             <w:r>
               <w:rPr>
                 <w:rFonts w:ascii="Times New Roman" w:eastAsia="Times New Roman" w:hAnsi="Times New Roman" w:cs="Times New Roman"/>
                 <w:kern w:val="0"/>
-                <w14:ligatures w14:val="none"/>
               </w:rPr>
               <w:t>Matters; likely tied to </w:t>
             </w:r>
@@ -2669,7 +2738,6 @@
                 <w:b/>
                 <w:bCs/>
                 <w:kern w:val="0"/>
-                <w14:ligatures w14:val="none"/>
               </w:rPr>
               <w:t>K/N</w:t>
             </w:r>
@@ -2677,7 +2745,6 @@
               <w:rPr>
                 <w:rFonts w:ascii="Times New Roman" w:eastAsia="Times New Roman" w:hAnsi="Times New Roman" w:cs="Times New Roman"/>
                 <w:kern w:val="0"/>
-                <w14:ligatures w14:val="none"/>
               </w:rPr>
               <w:t> (success rate), not “median of selected”</w:t>
             </w:r>
@@ -2687,7 +2754,13 @@
       <w:tr>
         <w:tc>
           <w:tcPr>
-            <w:tcW w:w="0" w:type="auto"/>
+            <w:tcW w:w="2335" w:type="dxa"/>
+            <w:tcBorders>
+              <w:top w:val="single" w:sz="4" w:space="0" w:color="auto"/>
+              <w:left w:val="single" w:sz="4" w:space="0" w:color="auto"/>
+              <w:bottom w:val="single" w:sz="4" w:space="0" w:color="auto"/>
+              <w:right w:val="single" w:sz="4" w:space="0" w:color="auto"/>
+            </w:tcBorders>
             <w:tcMar>
               <w:top w:w="75" w:type="dxa"/>
               <w:left w:w="135" w:type="dxa"/>
@@ -2702,7 +2775,6 @@
               <w:rPr>
                 <w:rFonts w:ascii="Times New Roman" w:eastAsia="Times New Roman" w:hAnsi="Times New Roman" w:cs="Times New Roman"/>
                 <w:kern w:val="0"/>
-                <w14:ligatures w14:val="none"/>
               </w:rPr>
             </w:pPr>
             <w:r>
@@ -2711,7 +2783,6 @@
                 <w:b/>
                 <w:bCs/>
                 <w:kern w:val="0"/>
-                <w14:ligatures w14:val="none"/>
               </w:rPr>
               <w:t>γ</w:t>
             </w:r>
@@ -2719,7 +2790,6 @@
               <w:rPr>
                 <w:rFonts w:ascii="Times New Roman" w:eastAsia="Times New Roman" w:hAnsi="Times New Roman" w:cs="Times New Roman"/>
                 <w:kern w:val="0"/>
-                <w14:ligatures w14:val="none"/>
               </w:rPr>
               <w:t> (sigmoid slope)</w:t>
             </w:r>
@@ -2727,7 +2797,13 @@
         </w:tc>
         <w:tc>
           <w:tcPr>
-            <w:tcW w:w="0" w:type="auto"/>
+            <w:tcW w:w="8455" w:type="dxa"/>
+            <w:tcBorders>
+              <w:top w:val="single" w:sz="4" w:space="0" w:color="auto"/>
+              <w:left w:val="single" w:sz="4" w:space="0" w:color="auto"/>
+              <w:bottom w:val="single" w:sz="4" w:space="0" w:color="auto"/>
+              <w:right w:val="single" w:sz="4" w:space="0" w:color="auto"/>
+            </w:tcBorders>
             <w:tcMar>
               <w:top w:w="75" w:type="dxa"/>
               <w:left w:w="135" w:type="dxa"/>
@@ -2742,14 +2818,12 @@
               <w:rPr>
                 <w:rFonts w:ascii="Times New Roman" w:eastAsia="Times New Roman" w:hAnsi="Times New Roman" w:cs="Times New Roman"/>
                 <w:kern w:val="0"/>
-                <w14:ligatures w14:val="none"/>
               </w:rPr>
             </w:pPr>
             <w:r>
               <w:rPr>
                 <w:rFonts w:ascii="Times New Roman" w:eastAsia="Times New Roman" w:hAnsi="Times New Roman" w:cs="Times New Roman"/>
                 <w:kern w:val="0"/>
-                <w14:ligatures w14:val="none"/>
               </w:rPr>
               <w:t>Characterize</w:t>
             </w:r>
@@ -2759,7 +2833,13 @@
       <w:tr>
         <w:tc>
           <w:tcPr>
-            <w:tcW w:w="0" w:type="auto"/>
+            <w:tcW w:w="2335" w:type="dxa"/>
+            <w:tcBorders>
+              <w:top w:val="single" w:sz="4" w:space="0" w:color="auto"/>
+              <w:left w:val="single" w:sz="4" w:space="0" w:color="auto"/>
+              <w:bottom w:val="single" w:sz="4" w:space="0" w:color="auto"/>
+              <w:right w:val="single" w:sz="4" w:space="0" w:color="auto"/>
+            </w:tcBorders>
             <w:tcMar>
               <w:top w:w="75" w:type="dxa"/>
               <w:left w:w="135" w:type="dxa"/>
@@ -2774,7 +2854,6 @@
               <w:rPr>
                 <w:rFonts w:ascii="Times New Roman" w:eastAsia="Times New Roman" w:hAnsi="Times New Roman" w:cs="Times New Roman"/>
                 <w:kern w:val="0"/>
-                <w14:ligatures w14:val="none"/>
               </w:rPr>
             </w:pPr>
             <w:r>
@@ -2783,7 +2862,6 @@
                 <w:b/>
                 <w:bCs/>
                 <w:kern w:val="0"/>
-                <w14:ligatures w14:val="none"/>
               </w:rPr>
               <w:t xml:space="preserve">Distribution of </w:t>
             </w:r>
@@ -2833,7 +2911,13 @@
         </w:tc>
         <w:tc>
           <w:tcPr>
-            <w:tcW w:w="0" w:type="auto"/>
+            <w:tcW w:w="8455" w:type="dxa"/>
+            <w:tcBorders>
+              <w:top w:val="single" w:sz="4" w:space="0" w:color="auto"/>
+              <w:left w:val="single" w:sz="4" w:space="0" w:color="auto"/>
+              <w:bottom w:val="single" w:sz="4" w:space="0" w:color="auto"/>
+              <w:right w:val="single" w:sz="4" w:space="0" w:color="auto"/>
+            </w:tcBorders>
             <w:tcMar>
               <w:top w:w="75" w:type="dxa"/>
               <w:left w:w="135" w:type="dxa"/>
@@ -2848,14 +2932,12 @@
               <w:rPr>
                 <w:rFonts w:ascii="Times New Roman" w:eastAsia="Times New Roman" w:hAnsi="Times New Roman" w:cs="Times New Roman"/>
                 <w:kern w:val="0"/>
-                <w14:ligatures w14:val="none"/>
               </w:rPr>
             </w:pPr>
             <w:r>
               <w:rPr>
                 <w:rFonts w:ascii="Times New Roman" w:eastAsia="Times New Roman" w:hAnsi="Times New Roman" w:cs="Times New Roman"/>
                 <w:kern w:val="0"/>
-                <w14:ligatures w14:val="none"/>
               </w:rPr>
               <w:t>Probably doesn’t matter much (CLT on team averages) — but </w:t>
             </w:r>
@@ -2865,7 +2947,6 @@
                 <w:b/>
                 <w:bCs/>
                 <w:kern w:val="0"/>
-                <w14:ligatures w14:val="none"/>
               </w:rPr>
               <w:t>document</w:t>
             </w:r>
@@ -2873,7 +2954,6 @@
               <w:rPr>
                 <w:rFonts w:ascii="Times New Roman" w:eastAsia="Times New Roman" w:hAnsi="Times New Roman" w:cs="Times New Roman"/>
                 <w:kern w:val="0"/>
-                <w14:ligatures w14:val="none"/>
               </w:rPr>
               <w:t> choice + SI robustness</w:t>
             </w:r>
@@ -2883,7 +2963,13 @@
       <w:tr>
         <w:tc>
           <w:tcPr>
-            <w:tcW w:w="0" w:type="auto"/>
+            <w:tcW w:w="2335" w:type="dxa"/>
+            <w:tcBorders>
+              <w:top w:val="single" w:sz="4" w:space="0" w:color="auto"/>
+              <w:left w:val="single" w:sz="4" w:space="0" w:color="auto"/>
+              <w:bottom w:val="single" w:sz="4" w:space="0" w:color="auto"/>
+              <w:right w:val="single" w:sz="4" w:space="0" w:color="auto"/>
+            </w:tcBorders>
             <w:tcMar>
               <w:top w:w="75" w:type="dxa"/>
               <w:left w:w="135" w:type="dxa"/>
@@ -2898,7 +2984,6 @@
               <w:rPr>
                 <w:rFonts w:ascii="Times New Roman" w:eastAsia="Times New Roman" w:hAnsi="Times New Roman" w:cs="Times New Roman"/>
                 <w:kern w:val="0"/>
-                <w14:ligatures w14:val="none"/>
               </w:rPr>
             </w:pPr>
             <w:r>
@@ -2907,7 +2992,6 @@
                 <w:b/>
                 <w:bCs/>
                 <w:kern w:val="0"/>
-                <w14:ligatures w14:val="none"/>
               </w:rPr>
               <w:t xml:space="preserve">Distribution of </w:t>
             </w:r>
@@ -2957,7 +3041,13 @@
         </w:tc>
         <w:tc>
           <w:tcPr>
-            <w:tcW w:w="0" w:type="auto"/>
+            <w:tcW w:w="8455" w:type="dxa"/>
+            <w:tcBorders>
+              <w:top w:val="single" w:sz="4" w:space="0" w:color="auto"/>
+              <w:left w:val="single" w:sz="4" w:space="0" w:color="auto"/>
+              <w:bottom w:val="single" w:sz="4" w:space="0" w:color="auto"/>
+              <w:right w:val="single" w:sz="4" w:space="0" w:color="auto"/>
+            </w:tcBorders>
             <w:tcMar>
               <w:top w:w="75" w:type="dxa"/>
               <w:left w:w="135" w:type="dxa"/>
@@ -2972,14 +3062,12 @@
               <w:rPr>
                 <w:rFonts w:ascii="Times New Roman" w:eastAsia="Times New Roman" w:hAnsi="Times New Roman" w:cs="Times New Roman"/>
                 <w:kern w:val="0"/>
-                <w14:ligatures w14:val="none"/>
               </w:rPr>
             </w:pPr>
             <w:r>
               <w:rPr>
                 <w:rFonts w:ascii="Times New Roman" w:eastAsia="Times New Roman" w:hAnsi="Times New Roman" w:cs="Times New Roman"/>
                 <w:kern w:val="0"/>
-                <w14:ligatures w14:val="none"/>
               </w:rPr>
               <w:t>Fix from empirical ballpark; characterize</w:t>
             </w:r>
@@ -2989,7 +3077,13 @@
       <w:tr>
         <w:tc>
           <w:tcPr>
-            <w:tcW w:w="0" w:type="auto"/>
+            <w:tcW w:w="2335" w:type="dxa"/>
+            <w:tcBorders>
+              <w:top w:val="single" w:sz="4" w:space="0" w:color="auto"/>
+              <w:left w:val="single" w:sz="4" w:space="0" w:color="auto"/>
+              <w:bottom w:val="single" w:sz="4" w:space="0" w:color="auto"/>
+              <w:right w:val="single" w:sz="4" w:space="0" w:color="auto"/>
+            </w:tcBorders>
             <w:tcMar>
               <w:top w:w="75" w:type="dxa"/>
               <w:left w:w="135" w:type="dxa"/>
@@ -3004,7 +3098,6 @@
               <w:rPr>
                 <w:rFonts w:ascii="Times New Roman" w:eastAsia="Times New Roman" w:hAnsi="Times New Roman" w:cs="Times New Roman"/>
                 <w:kern w:val="0"/>
-                <w14:ligatures w14:val="none"/>
               </w:rPr>
             </w:pPr>
             <w:r>
@@ -3013,7 +3106,6 @@
                 <w:b/>
                 <w:bCs/>
                 <w:kern w:val="0"/>
-                <w14:ligatures w14:val="none"/>
               </w:rPr>
               <w:t>K/N</w:t>
             </w:r>
@@ -3021,7 +3113,6 @@
               <w:rPr>
                 <w:rFonts w:ascii="Times New Roman" w:eastAsia="Times New Roman" w:hAnsi="Times New Roman" w:cs="Times New Roman"/>
                 <w:kern w:val="0"/>
-                <w14:ligatures w14:val="none"/>
               </w:rPr>
               <w:t> (selection rate)</w:t>
             </w:r>
@@ -3029,7 +3120,13 @@
         </w:tc>
         <w:tc>
           <w:tcPr>
-            <w:tcW w:w="0" w:type="auto"/>
+            <w:tcW w:w="8455" w:type="dxa"/>
+            <w:tcBorders>
+              <w:top w:val="single" w:sz="4" w:space="0" w:color="auto"/>
+              <w:left w:val="single" w:sz="4" w:space="0" w:color="auto"/>
+              <w:bottom w:val="single" w:sz="4" w:space="0" w:color="auto"/>
+              <w:right w:val="single" w:sz="4" w:space="0" w:color="auto"/>
+            </w:tcBorders>
             <w:tcMar>
               <w:top w:w="75" w:type="dxa"/>
               <w:left w:w="135" w:type="dxa"/>
@@ -3044,7 +3141,6 @@
               <w:rPr>
                 <w:rFonts w:ascii="Times New Roman" w:eastAsia="Times New Roman" w:hAnsi="Times New Roman" w:cs="Times New Roman"/>
                 <w:kern w:val="0"/>
-                <w14:ligatures w14:val="none"/>
               </w:rPr>
             </w:pPr>
             <w:r>
@@ -3053,7 +3149,6 @@
                 <w:b/>
                 <w:bCs/>
                 <w:kern w:val="0"/>
-                <w14:ligatures w14:val="none"/>
               </w:rPr>
               <w:t>System feature</w:t>
             </w:r>
@@ -3061,7 +3156,6 @@
               <w:rPr>
                 <w:rFonts w:ascii="Times New Roman" w:eastAsia="Times New Roman" w:hAnsi="Times New Roman" w:cs="Times New Roman"/>
                 <w:kern w:val="0"/>
-                <w14:ligatures w14:val="none"/>
               </w:rPr>
               <w:t> — “everybody gets a trophy” vs highly selective regimes</w:t>
             </w:r>
@@ -3079,19 +3173,17 @@
           <w:kern w:val="0"/>
           <w:sz w:val="20"/>
           <w:szCs w:val="20"/>
-          <w14:ligatures w14:val="none"/>
-        </w:rPr>
-      </w:pPr>
-      <w:r>
-        <w:rPr>
-          <w:rFonts w:ascii="Arial" w:eastAsia="Times New Roman" w:hAnsi="Arial" w:cs="Arial"/>
-          <w:b/>
-          <w:bCs/>
-          <w:color w:val="3B3B3B"/>
-          <w:kern w:val="0"/>
-          <w:sz w:val="20"/>
-          <w:szCs w:val="20"/>
-          <w14:ligatures w14:val="none"/>
+        </w:rPr>
+      </w:pPr>
+      <w:r>
+        <w:rPr>
+          <w:rFonts w:ascii="Arial" w:eastAsia="Times New Roman" w:hAnsi="Arial" w:cs="Arial"/>
+          <w:b/>
+          <w:bCs/>
+          <w:color w:val="3B3B3B"/>
+          <w:kern w:val="0"/>
+          <w:sz w:val="20"/>
+          <w:szCs w:val="20"/>
         </w:rPr>
         <w:t>Not yet:</w:t>
       </w:r>
@@ -3102,7 +3194,6 @@
           <w:kern w:val="0"/>
           <w:sz w:val="20"/>
           <w:szCs w:val="20"/>
-          <w14:ligatures w14:val="none"/>
         </w:rPr>
         <w:t> full statistical fitting to real data. At ~41:44: </w:t>
       </w:r>
@@ -3115,7 +3206,6 @@
           <w:kern w:val="0"/>
           <w:sz w:val="20"/>
           <w:szCs w:val="20"/>
-          <w14:ligatures w14:val="none"/>
         </w:rPr>
         <w:t>“I’m not caring about fitting to data yet — just characterize what’s going on.”</w:t>
       </w:r>
@@ -3130,19 +3220,17 @@
           <w:kern w:val="0"/>
           <w:sz w:val="20"/>
           <w:szCs w:val="20"/>
-          <w14:ligatures w14:val="none"/>
-        </w:rPr>
-      </w:pPr>
-      <w:r>
-        <w:rPr>
-          <w:rFonts w:ascii="Arial" w:eastAsia="Times New Roman" w:hAnsi="Arial" w:cs="Arial"/>
-          <w:b/>
-          <w:bCs/>
-          <w:color w:val="3B3B3B"/>
-          <w:kern w:val="0"/>
-          <w:sz w:val="20"/>
-          <w:szCs w:val="20"/>
-          <w14:ligatures w14:val="none"/>
+        </w:rPr>
+      </w:pPr>
+      <w:r>
+        <w:rPr>
+          <w:rFonts w:ascii="Arial" w:eastAsia="Times New Roman" w:hAnsi="Arial" w:cs="Arial"/>
+          <w:b/>
+          <w:bCs/>
+          <w:color w:val="3B3B3B"/>
+          <w:kern w:val="0"/>
+          <w:sz w:val="20"/>
+          <w:szCs w:val="20"/>
         </w:rPr>
         <w:t>Pace:</w:t>
       </w:r>
@@ -3153,7 +3241,6 @@
           <w:kern w:val="0"/>
           <w:sz w:val="20"/>
           <w:szCs w:val="20"/>
-          <w14:ligatures w14:val="none"/>
         </w:rPr>
         <w:t> ~two knobs per day → ~four days for a solid characterization deck. </w:t>
       </w:r>
@@ -3166,7 +3253,6 @@
           <w:kern w:val="0"/>
           <w:sz w:val="20"/>
           <w:szCs w:val="20"/>
-          <w14:ligatures w14:val="none"/>
         </w:rPr>
         <w:t>Checkpoint with Alex after the first two</w:t>
       </w:r>
@@ -3177,7 +3263,6 @@
           <w:kern w:val="0"/>
           <w:sz w:val="20"/>
           <w:szCs w:val="20"/>
-          <w14:ligatures w14:val="none"/>
         </w:rPr>
         <w:t> (ρ and λ).</w:t>
       </w:r>
@@ -3195,7 +3280,6 @@
           <w:kern w:val="0"/>
           <w:sz w:val="29"/>
           <w:szCs w:val="29"/>
-          <w14:ligatures w14:val="none"/>
         </w:rPr>
       </w:pPr>
       <w:r>
@@ -3207,7 +3291,6 @@
           <w:kern w:val="0"/>
           <w:sz w:val="29"/>
           <w:szCs w:val="29"/>
-          <w14:ligatures w14:val="none"/>
         </w:rPr>
         <w:t>Layer 3 — Next big insight (after characterization): statistical fitting, not curve matching</w:t>
       </w:r>
@@ -3222,19 +3305,17 @@
           <w:kern w:val="0"/>
           <w:sz w:val="20"/>
           <w:szCs w:val="20"/>
-          <w14:ligatures w14:val="none"/>
-        </w:rPr>
-      </w:pPr>
-      <w:r>
-        <w:rPr>
-          <w:rFonts w:ascii="Arial" w:eastAsia="Times New Roman" w:hAnsi="Arial" w:cs="Arial"/>
-          <w:b/>
-          <w:bCs/>
-          <w:color w:val="3B3B3B"/>
-          <w:kern w:val="0"/>
-          <w:sz w:val="20"/>
-          <w:szCs w:val="20"/>
-          <w14:ligatures w14:val="none"/>
+        </w:rPr>
+      </w:pPr>
+      <w:r>
+        <w:rPr>
+          <w:rFonts w:ascii="Arial" w:eastAsia="Times New Roman" w:hAnsi="Arial" w:cs="Arial"/>
+          <w:b/>
+          <w:bCs/>
+          <w:color w:val="3B3B3B"/>
+          <w:kern w:val="0"/>
+          <w:sz w:val="20"/>
+          <w:szCs w:val="20"/>
         </w:rPr>
         <w:t>Do NOT:</w:t>
       </w:r>
@@ -3245,7 +3326,6 @@
           <w:kern w:val="0"/>
           <w:sz w:val="20"/>
           <w:szCs w:val="20"/>
-          <w14:ligatures w14:val="none"/>
         </w:rPr>
         <w:t> pick ρ or λ by minimizing distance between empirical Hero curve and simulated curve → that’s </w:t>
       </w:r>
@@ -3258,7 +3338,6 @@
           <w:kern w:val="0"/>
           <w:sz w:val="20"/>
           <w:szCs w:val="20"/>
-          <w14:ligatures w14:val="none"/>
         </w:rPr>
         <w:t>curve fitting</w:t>
       </w:r>
@@ -3269,7 +3348,6 @@
           <w:kern w:val="0"/>
           <w:sz w:val="20"/>
           <w:szCs w:val="20"/>
-          <w14:ligatures w14:val="none"/>
         </w:rPr>
         <w:t>.</w:t>
       </w:r>
@@ -3284,19 +3362,17 @@
           <w:kern w:val="0"/>
           <w:sz w:val="20"/>
           <w:szCs w:val="20"/>
-          <w14:ligatures w14:val="none"/>
-        </w:rPr>
-      </w:pPr>
-      <w:r>
-        <w:rPr>
-          <w:rFonts w:ascii="Arial" w:eastAsia="Times New Roman" w:hAnsi="Arial" w:cs="Arial"/>
-          <w:b/>
-          <w:bCs/>
-          <w:color w:val="3B3B3B"/>
-          <w:kern w:val="0"/>
-          <w:sz w:val="20"/>
-          <w:szCs w:val="20"/>
-          <w14:ligatures w14:val="none"/>
+        </w:rPr>
+      </w:pPr>
+      <w:r>
+        <w:rPr>
+          <w:rFonts w:ascii="Arial" w:eastAsia="Times New Roman" w:hAnsi="Arial" w:cs="Arial"/>
+          <w:b/>
+          <w:bCs/>
+          <w:color w:val="3B3B3B"/>
+          <w:kern w:val="0"/>
+          <w:sz w:val="20"/>
+          <w:szCs w:val="20"/>
         </w:rPr>
         <w:t>DO:</w:t>
       </w:r>
@@ -3307,7 +3383,6 @@
           <w:kern w:val="0"/>
           <w:sz w:val="20"/>
           <w:szCs w:val="20"/>
-          <w14:ligatures w14:val="none"/>
         </w:rPr>
         <w:t> define a </w:t>
       </w:r>
@@ -3320,7 +3395,6 @@
           <w:kern w:val="0"/>
           <w:sz w:val="20"/>
           <w:szCs w:val="20"/>
-          <w14:ligatures w14:val="none"/>
         </w:rPr>
         <w:t>statistic of the raw data</w:t>
       </w:r>
@@ -3331,7 +3405,6 @@
           <w:kern w:val="0"/>
           <w:sz w:val="20"/>
           <w:szCs w:val="20"/>
-          <w14:ligatures w14:val="none"/>
         </w:rPr>
         <w:t> for each parameter:</w:t>
       </w:r>
@@ -3350,19 +3423,17 @@
           <w:kern w:val="0"/>
           <w:sz w:val="20"/>
           <w:szCs w:val="20"/>
-          <w14:ligatures w14:val="none"/>
-        </w:rPr>
-      </w:pPr>
-      <w:r>
-        <w:rPr>
-          <w:rFonts w:ascii="Arial" w:eastAsia="Times New Roman" w:hAnsi="Arial" w:cs="Arial"/>
-          <w:b/>
-          <w:bCs/>
-          <w:color w:val="3B3B3B"/>
-          <w:kern w:val="0"/>
-          <w:sz w:val="20"/>
-          <w:szCs w:val="20"/>
-          <w14:ligatures w14:val="none"/>
+        </w:rPr>
+      </w:pPr>
+      <w:r>
+        <w:rPr>
+          <w:rFonts w:ascii="Arial" w:eastAsia="Times New Roman" w:hAnsi="Arial" w:cs="Arial"/>
+          <w:b/>
+          <w:bCs/>
+          <w:color w:val="3B3B3B"/>
+          <w:kern w:val="0"/>
+          <w:sz w:val="20"/>
+          <w:szCs w:val="20"/>
         </w:rPr>
         <w:t>ρ:</w:t>
       </w:r>
@@ -3373,7 +3444,6 @@
           <w:kern w:val="0"/>
           <w:sz w:val="20"/>
           <w:szCs w:val="20"/>
-          <w14:ligatures w14:val="none"/>
         </w:rPr>
         <w:t> e.g. </w:t>
       </w:r>
@@ -3386,7 +3456,6 @@
           <w:kern w:val="0"/>
           <w:sz w:val="20"/>
           <w:szCs w:val="20"/>
-          <w14:ligatures w14:val="none"/>
         </w:rPr>
         <w:t>within-team correlation of ability</w:t>
       </w:r>
@@ -3397,7 +3466,6 @@
           <w:kern w:val="0"/>
           <w:sz w:val="20"/>
           <w:szCs w:val="20"/>
-          <w14:ligatures w14:val="none"/>
         </w:rPr>
         <w:t> (maybe log-transformed) — model-invariant, computable from data alone</w:t>
       </w:r>
@@ -3416,19 +3484,17 @@
           <w:kern w:val="0"/>
           <w:sz w:val="20"/>
           <w:szCs w:val="20"/>
-          <w14:ligatures w14:val="none"/>
-        </w:rPr>
-      </w:pPr>
-      <w:r>
-        <w:rPr>
-          <w:rFonts w:ascii="Arial" w:eastAsia="Times New Roman" w:hAnsi="Arial" w:cs="Arial"/>
-          <w:b/>
-          <w:bCs/>
-          <w:color w:val="3B3B3B"/>
-          <w:kern w:val="0"/>
-          <w:sz w:val="20"/>
-          <w:szCs w:val="20"/>
-          <w14:ligatures w14:val="none"/>
+        </w:rPr>
+      </w:pPr>
+      <w:r>
+        <w:rPr>
+          <w:rFonts w:ascii="Arial" w:eastAsia="Times New Roman" w:hAnsi="Arial" w:cs="Arial"/>
+          <w:b/>
+          <w:bCs/>
+          <w:color w:val="3B3B3B"/>
+          <w:kern w:val="0"/>
+          <w:sz w:val="20"/>
+          <w:szCs w:val="20"/>
         </w:rPr>
         <w:t>λ:</w:t>
       </w:r>
@@ -3439,7 +3505,6 @@
           <w:kern w:val="0"/>
           <w:sz w:val="20"/>
           <w:szCs w:val="20"/>
-          <w14:ligatures w14:val="none"/>
         </w:rPr>
         <w:t> a </w:t>
       </w:r>
@@ -3452,7 +3517,6 @@
           <w:kern w:val="0"/>
           <w:sz w:val="20"/>
           <w:szCs w:val="20"/>
-          <w14:ligatures w14:val="none"/>
         </w:rPr>
         <w:t>roster-pressure statistic</w:t>
       </w:r>
@@ -3463,7 +3527,6 @@
           <w:kern w:val="0"/>
           <w:sz w:val="20"/>
           <w:szCs w:val="20"/>
-          <w14:ligatures w14:val="none"/>
         </w:rPr>
         <w:t> — autocorrelation / “if a teammate gets promoted, what does that tell you about your odds?” — </w:t>
       </w:r>
@@ -3476,7 +3539,6 @@
           <w:kern w:val="0"/>
           <w:sz w:val="20"/>
           <w:szCs w:val="20"/>
-          <w14:ligatures w14:val="none"/>
         </w:rPr>
         <w:t>not</w:t>
       </w:r>
@@ -3487,7 +3549,6 @@
           <w:kern w:val="0"/>
           <w:sz w:val="20"/>
           <w:szCs w:val="20"/>
-          <w14:ligatures w14:val="none"/>
         </w:rPr>
         <w:t> the sim selection-score formula</w:t>
       </w:r>
@@ -3502,17 +3563,15 @@
           <w:kern w:val="0"/>
           <w:sz w:val="20"/>
           <w:szCs w:val="20"/>
-          <w14:ligatures w14:val="none"/>
-        </w:rPr>
-      </w:pPr>
-      <w:r>
-        <w:rPr>
-          <w:rFonts w:ascii="Arial" w:eastAsia="Times New Roman" w:hAnsi="Arial" w:cs="Arial"/>
-          <w:color w:val="3B3B3B"/>
-          <w:kern w:val="0"/>
-          <w:sz w:val="20"/>
-          <w:szCs w:val="20"/>
-          <w14:ligatures w14:val="none"/>
+        </w:rPr>
+      </w:pPr>
+      <w:r>
+        <w:rPr>
+          <w:rFonts w:ascii="Arial" w:eastAsia="Times New Roman" w:hAnsi="Arial" w:cs="Arial"/>
+          <w:color w:val="3B3B3B"/>
+          <w:kern w:val="0"/>
+          <w:sz w:val="20"/>
+          <w:szCs w:val="20"/>
         </w:rPr>
         <w:t>If you nail that, you’re “putting a metric on the effect” and “really going somewhere.”</w:t>
       </w:r>
@@ -3527,17 +3586,15 @@
           <w:kern w:val="0"/>
           <w:sz w:val="20"/>
           <w:szCs w:val="20"/>
-          <w14:ligatures w14:val="none"/>
-        </w:rPr>
-      </w:pPr>
-      <w:r>
-        <w:rPr>
-          <w:rFonts w:ascii="Arial" w:eastAsia="Times New Roman" w:hAnsi="Arial" w:cs="Arial"/>
-          <w:color w:val="3B3B3B"/>
-          <w:kern w:val="0"/>
-          <w:sz w:val="20"/>
-          <w:szCs w:val="20"/>
-          <w14:ligatures w14:val="none"/>
+        </w:rPr>
+      </w:pPr>
+      <w:r>
+        <w:rPr>
+          <w:rFonts w:ascii="Arial" w:eastAsia="Times New Roman" w:hAnsi="Arial" w:cs="Arial"/>
+          <w:color w:val="3B3B3B"/>
+          <w:kern w:val="0"/>
+          <w:sz w:val="20"/>
+          <w:szCs w:val="20"/>
         </w:rPr>
         <w:t>PD14 magnitude (Model A vs B predictive comparison) is </w:t>
       </w:r>
@@ -3550,7 +3607,6 @@
           <w:kern w:val="0"/>
           <w:sz w:val="20"/>
           <w:szCs w:val="20"/>
-          <w14:ligatures w14:val="none"/>
         </w:rPr>
         <w:t>related</w:t>
       </w:r>
@@ -3561,7 +3617,6 @@
           <w:kern w:val="0"/>
           <w:sz w:val="20"/>
           <w:szCs w:val="20"/>
-          <w14:ligatures w14:val="none"/>
         </w:rPr>
         <w:t> but PD15 is sharper: estimators tied to </w:t>
       </w:r>
@@ -3574,7 +3629,6 @@
           <w:kern w:val="0"/>
           <w:sz w:val="20"/>
           <w:szCs w:val="20"/>
-          <w14:ligatures w14:val="none"/>
         </w:rPr>
         <w:t>parameters</w:t>
       </w:r>
@@ -3585,7 +3639,6 @@
           <w:kern w:val="0"/>
           <w:sz w:val="20"/>
           <w:szCs w:val="20"/>
-          <w14:ligatures w14:val="none"/>
         </w:rPr>
         <w:t>, not just better prediction. </w:t>
       </w:r>
@@ -3598,7 +3651,6 @@
           <w:kern w:val="0"/>
           <w:sz w:val="20"/>
           <w:szCs w:val="20"/>
-          <w14:ligatures w14:val="none"/>
         </w:rPr>
         <w:t>Park magnitude until characterization is done</w:t>
       </w:r>
@@ -3609,7 +3661,6 @@
           <w:kern w:val="0"/>
           <w:sz w:val="20"/>
           <w:szCs w:val="20"/>
-          <w14:ligatures w14:val="none"/>
         </w:rPr>
         <w:t> unless Alex says otherwise.</w:t>
       </w:r>
@@ -3622,22 +3673,8 @@
           <w:kern w:val="0"/>
           <w:sz w:val="20"/>
           <w:szCs w:val="20"/>
-          <w14:ligatures w14:val="none"/>
-        </w:rPr>
-      </w:pPr>
-      <w:r>
-        <w:rPr>
-          <w:noProof/>
-        </w:rPr>
-      </w:r>
-      <w:r>
-        <w:pict w14:anchorId="00093724">
-          <v:rect id="Horizontal Line 11" o:spid="_x0000_s1029" style="width:540pt;height:1.1pt;visibility:visible;mso-wrap-style:square;mso-left-percent:-10001;mso-top-percent:-10001;mso-position-horizontal:absolute;mso-position-horizontal-relative:char;mso-position-vertical:absolute;mso-position-vertical-relative:line;mso-left-percent:-10001;mso-top-percent:-10001;v-text-anchor:top" o:gfxdata="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" filled="f">
-            <o:lock v:ext="edit" rotation="t" aspectratio="t" verticies="t" text="t" shapetype="t"/>
-            <w10:anchorlock/>
-          </v:rect>
-        </w:pict>
-      </w:r>
+        </w:rPr>
+      </w:pPr>
     </w:p>
     <w:p>
       <w:pPr>
@@ -3652,7 +3689,6 @@
           <w:kern w:val="0"/>
           <w:sz w:val="32"/>
           <w:szCs w:val="32"/>
-          <w14:ligatures w14:val="none"/>
         </w:rPr>
       </w:pPr>
       <w:r>
@@ -3664,7 +3700,6 @@
           <w:kern w:val="0"/>
           <w:sz w:val="32"/>
           <w:szCs w:val="32"/>
-          <w14:ligatures w14:val="none"/>
         </w:rPr>
         <w:t>Other model notes from the conversation</w:t>
       </w:r>
@@ -3683,19 +3718,17 @@
           <w:kern w:val="0"/>
           <w:sz w:val="20"/>
           <w:szCs w:val="20"/>
-          <w14:ligatures w14:val="none"/>
-        </w:rPr>
-      </w:pPr>
-      <w:r>
-        <w:rPr>
-          <w:rFonts w:ascii="Arial" w:eastAsia="Times New Roman" w:hAnsi="Arial" w:cs="Arial"/>
-          <w:b/>
-          <w:bCs/>
-          <w:color w:val="3B3B3B"/>
-          <w:kern w:val="0"/>
-          <w:sz w:val="20"/>
-          <w:szCs w:val="20"/>
-          <w14:ligatures w14:val="none"/>
+        </w:rPr>
+      </w:pPr>
+      <w:r>
+        <w:rPr>
+          <w:rFonts w:ascii="Arial" w:eastAsia="Times New Roman" w:hAnsi="Arial" w:cs="Arial"/>
+          <w:b/>
+          <w:bCs/>
+          <w:color w:val="3B3B3B"/>
+          <w:kern w:val="0"/>
+          <w:sz w:val="20"/>
+          <w:szCs w:val="20"/>
         </w:rPr>
         <w:t>B/D vs L:</w:t>
       </w:r>
@@ -3706,7 +3739,6 @@
           <w:kern w:val="0"/>
           <w:sz w:val="20"/>
           <w:szCs w:val="20"/>
-          <w14:ligatures w14:val="none"/>
         </w:rPr>
         <w:t> Use </w:t>
       </w:r>
@@ -3768,7 +3800,6 @@
           <w:kern w:val="0"/>
           <w:sz w:val="20"/>
           <w:szCs w:val="20"/>
-          <w14:ligatures w14:val="none"/>
         </w:rPr>
         <w:t xml:space="preserve"> only for now; future work could split </w:t>
       </w:r>
@@ -3822,7 +3853,6 @@
           <w:kern w:val="0"/>
           <w:sz w:val="20"/>
           <w:szCs w:val="20"/>
-          <w14:ligatures w14:val="none"/>
         </w:rPr>
         <w:t xml:space="preserve"> and </w:t>
       </w:r>
@@ -3895,19 +3925,17 @@
           <w:kern w:val="0"/>
           <w:sz w:val="20"/>
           <w:szCs w:val="20"/>
-          <w14:ligatures w14:val="none"/>
-        </w:rPr>
-      </w:pPr>
-      <w:r>
-        <w:rPr>
-          <w:rFonts w:ascii="Arial" w:eastAsia="Times New Roman" w:hAnsi="Arial" w:cs="Arial"/>
-          <w:b/>
-          <w:bCs/>
-          <w:color w:val="3B3B3B"/>
-          <w:kern w:val="0"/>
-          <w:sz w:val="20"/>
-          <w:szCs w:val="20"/>
-          <w14:ligatures w14:val="none"/>
+        </w:rPr>
+      </w:pPr>
+      <w:r>
+        <w:rPr>
+          <w:rFonts w:ascii="Arial" w:eastAsia="Times New Roman" w:hAnsi="Arial" w:cs="Arial"/>
+          <w:b/>
+          <w:bCs/>
+          <w:color w:val="3B3B3B"/>
+          <w:kern w:val="0"/>
+          <w:sz w:val="20"/>
+          <w:szCs w:val="20"/>
         </w:rPr>
         <w:t>Notation:</w:t>
       </w:r>
@@ -3918,7 +3946,6 @@
           <w:kern w:val="0"/>
           <w:sz w:val="20"/>
           <w:szCs w:val="20"/>
-          <w14:ligatures w14:val="none"/>
         </w:rPr>
         <w:t xml:space="preserve"> σ used twice (team </w:t>
       </w:r>
@@ -3972,7 +3999,6 @@
           <w:kern w:val="0"/>
           <w:sz w:val="20"/>
           <w:szCs w:val="20"/>
-          <w14:ligatures w14:val="none"/>
         </w:rPr>
         <w:t xml:space="preserve"> vs sigmoid σ) — fix. </w:t>
       </w:r>
@@ -3985,7 +4011,6 @@
           <w:kern w:val="0"/>
           <w:sz w:val="20"/>
           <w:szCs w:val="20"/>
-          <w14:ligatures w14:val="none"/>
         </w:rPr>
         <w:t>θ</w:t>
       </w:r>
@@ -3996,7 +4021,6 @@
           <w:kern w:val="0"/>
           <w:sz w:val="20"/>
           <w:szCs w:val="20"/>
-          <w14:ligatures w14:val="none"/>
         </w:rPr>
         <w:t> = sigmoid center (not median of selected). </w:t>
       </w:r>
@@ -4009,7 +4033,6 @@
           <w:kern w:val="0"/>
           <w:sz w:val="20"/>
           <w:szCs w:val="20"/>
-          <w14:ligatures w14:val="none"/>
         </w:rPr>
         <w:t>γ</w:t>
       </w:r>
@@ -4020,7 +4043,6 @@
           <w:kern w:val="0"/>
           <w:sz w:val="20"/>
           <w:szCs w:val="20"/>
-          <w14:ligatures w14:val="none"/>
         </w:rPr>
         <w:t> = sigmoid slope.</w:t>
       </w:r>
@@ -4039,19 +4061,17 @@
           <w:kern w:val="0"/>
           <w:sz w:val="20"/>
           <w:szCs w:val="20"/>
-          <w14:ligatures w14:val="none"/>
-        </w:rPr>
-      </w:pPr>
-      <w:r>
-        <w:rPr>
-          <w:rFonts w:ascii="Arial" w:eastAsia="Times New Roman" w:hAnsi="Arial" w:cs="Arial"/>
-          <w:b/>
-          <w:bCs/>
-          <w:color w:val="3B3B3B"/>
-          <w:kern w:val="0"/>
-          <w:sz w:val="20"/>
-          <w:szCs w:val="20"/>
-          <w14:ligatures w14:val="none"/>
+        </w:rPr>
+      </w:pPr>
+      <w:r>
+        <w:rPr>
+          <w:rFonts w:ascii="Arial" w:eastAsia="Times New Roman" w:hAnsi="Arial" w:cs="Arial"/>
+          <w:b/>
+          <w:bCs/>
+          <w:color w:val="3B3B3B"/>
+          <w:kern w:val="0"/>
+          <w:sz w:val="20"/>
+          <w:szCs w:val="20"/>
         </w:rPr>
         <w:t>θ and K/N:</w:t>
       </w:r>
@@ -4062,7 +4082,6 @@
           <w:kern w:val="0"/>
           <w:sz w:val="20"/>
           <w:szCs w:val="20"/>
-          <w14:ligatures w14:val="none"/>
         </w:rPr>
         <w:t> Centering θ likely depends on </w:t>
       </w:r>
@@ -4075,7 +4094,6 @@
           <w:kern w:val="0"/>
           <w:sz w:val="20"/>
           <w:szCs w:val="20"/>
-          <w14:ligatures w14:val="none"/>
         </w:rPr>
         <w:t>K/N</w:t>
       </w:r>
@@ -4086,7 +4104,6 @@
           <w:kern w:val="0"/>
           <w:sz w:val="20"/>
           <w:szCs w:val="20"/>
-          <w14:ligatures w14:val="none"/>
         </w:rPr>
         <w:t> (draft slots / population), a fixed </w:t>
       </w:r>
@@ -4099,7 +4116,6 @@
           <w:kern w:val="0"/>
           <w:sz w:val="20"/>
           <w:szCs w:val="20"/>
-          <w14:ligatures w14:val="none"/>
         </w:rPr>
         <w:t>system property</w:t>
       </w:r>
@@ -4110,7 +4126,6 @@
           <w:kern w:val="0"/>
           <w:sz w:val="20"/>
           <w:szCs w:val="20"/>
-          <w14:ligatures w14:val="none"/>
         </w:rPr>
         <w:t> (MBB vs Army differ) — sweep it, don’t collapse it.</w:t>
       </w:r>
@@ -4129,7 +4144,6 @@
           <w:kern w:val="0"/>
           <w:sz w:val="20"/>
           <w:szCs w:val="20"/>
-          <w14:ligatures w14:val="none"/>
         </w:rPr>
       </w:pPr>
       <m:oMath>
@@ -4192,7 +4206,6 @@
           <w:kern w:val="0"/>
           <w:sz w:val="20"/>
           <w:szCs w:val="20"/>
-          <w14:ligatures w14:val="none"/>
         </w:rPr>
         <w:t xml:space="preserve"> distribution:</w:t>
       </w:r>
@@ -4203,7 +4216,6 @@
           <w:kern w:val="0"/>
           <w:sz w:val="20"/>
           <w:szCs w:val="20"/>
-          <w14:ligatures w14:val="none"/>
         </w:rPr>
         <w:t> Alex expects </w:t>
       </w:r>
@@ -4216,7 +4228,6 @@
           <w:kern w:val="0"/>
           <w:sz w:val="20"/>
           <w:szCs w:val="20"/>
-          <w14:ligatures w14:val="none"/>
         </w:rPr>
         <w:t>robustness</w:t>
       </w:r>
@@ -4227,7 +4238,6 @@
           <w:kern w:val="0"/>
           <w:sz w:val="20"/>
           <w:szCs w:val="20"/>
-          <w14:ligatures w14:val="none"/>
         </w:rPr>
         <w:t> (enough spread; CLT on team means), not power-law dependence — show alternatives in SI.</w:t>
       </w:r>
@@ -4246,19 +4256,17 @@
           <w:kern w:val="0"/>
           <w:sz w:val="20"/>
           <w:szCs w:val="20"/>
-          <w14:ligatures w14:val="none"/>
-        </w:rPr>
-      </w:pPr>
-      <w:r>
-        <w:rPr>
-          <w:rFonts w:ascii="Arial" w:eastAsia="Times New Roman" w:hAnsi="Arial" w:cs="Arial"/>
-          <w:b/>
-          <w:bCs/>
-          <w:color w:val="3B3B3B"/>
-          <w:kern w:val="0"/>
-          <w:sz w:val="20"/>
-          <w:szCs w:val="20"/>
-          <w14:ligatures w14:val="none"/>
+        </w:rPr>
+      </w:pPr>
+      <w:r>
+        <w:rPr>
+          <w:rFonts w:ascii="Arial" w:eastAsia="Times New Roman" w:hAnsi="Arial" w:cs="Arial"/>
+          <w:b/>
+          <w:bCs/>
+          <w:color w:val="3B3B3B"/>
+          <w:kern w:val="0"/>
+          <w:sz w:val="20"/>
+          <w:szCs w:val="20"/>
         </w:rPr>
         <w:t>Process:</w:t>
       </w:r>
@@ -4269,7 +4277,6 @@
           <w:kern w:val="0"/>
           <w:sz w:val="20"/>
           <w:szCs w:val="20"/>
-          <w14:ligatures w14:val="none"/>
         </w:rPr>
         <w:t> 57-item checklist is too many; same failure mode as cranking calculations that feel like progress but aren’t the mission.</w:t>
       </w:r>
@@ -4282,22 +4289,8 @@
           <w:kern w:val="0"/>
           <w:sz w:val="20"/>
           <w:szCs w:val="20"/>
-          <w14:ligatures w14:val="none"/>
-        </w:rPr>
-      </w:pPr>
-      <w:r>
-        <w:rPr>
-          <w:noProof/>
-        </w:rPr>
-      </w:r>
-      <w:r>
-        <w:pict w14:anchorId="032C0C04">
-          <v:rect id="Horizontal Line 12" o:spid="_x0000_s1028" style="width:540pt;height:.05pt;visibility:visible;mso-wrap-style:square;mso-left-percent:-10001;mso-top-percent:-10001;mso-position-horizontal:absolute;mso-position-horizontal-relative:char;mso-position-vertical:absolute;mso-position-vertical-relative:line;mso-left-percent:-10001;mso-top-percent:-10001;v-text-anchor:top" o:gfxdata="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" filled="f">
-            <o:lock v:ext="edit" rotation="t" aspectratio="t" verticies="t" text="t" shapetype="t"/>
-            <w10:anchorlock/>
-          </v:rect>
-        </w:pict>
-      </w:r>
+        </w:rPr>
+      </w:pPr>
     </w:p>
     <w:p>
       <w:pPr>
@@ -4312,7 +4305,6 @@
           <w:kern w:val="0"/>
           <w:sz w:val="32"/>
           <w:szCs w:val="32"/>
-          <w14:ligatures w14:val="none"/>
         </w:rPr>
       </w:pPr>
       <w:r>
@@ -4324,7 +4316,6 @@
           <w:kern w:val="0"/>
           <w:sz w:val="32"/>
           <w:szCs w:val="32"/>
-          <w14:ligatures w14:val="none"/>
         </w:rPr>
         <w:t>How this supersedes the old checklist</w:t>
       </w:r>
@@ -4339,7 +4330,6 @@
           <w:kern w:val="0"/>
           <w:sz w:val="20"/>
           <w:szCs w:val="20"/>
-          <w14:ligatures w14:val="none"/>
         </w:rPr>
       </w:pPr>
       <w:r>
@@ -4349,7 +4339,6 @@
           <w:kern w:val="0"/>
           <w:sz w:val="18"/>
           <w:szCs w:val="18"/>
-          <w14:ligatures w14:val="none"/>
         </w:rPr>
         <w:t>CHARLES_CHECKLIST.md</w:t>
       </w:r>
@@ -4360,7 +4349,6 @@
           <w:kern w:val="0"/>
           <w:sz w:val="20"/>
           <w:szCs w:val="20"/>
-          <w14:ligatures w14:val="none"/>
         </w:rPr>
         <w:t> was re-entry + run Pass A/B + PD14 magnitude. That scaffold did its job.</w:t>
       </w:r>
@@ -4375,17 +4363,15 @@
           <w:kern w:val="0"/>
           <w:sz w:val="20"/>
           <w:szCs w:val="20"/>
-          <w14:ligatures w14:val="none"/>
-        </w:rPr>
-      </w:pPr>
-      <w:r>
-        <w:rPr>
-          <w:rFonts w:ascii="Arial" w:eastAsia="Times New Roman" w:hAnsi="Arial" w:cs="Arial"/>
-          <w:color w:val="3B3B3B"/>
-          <w:kern w:val="0"/>
-          <w:sz w:val="20"/>
-          <w:szCs w:val="20"/>
-          <w14:ligatures w14:val="none"/>
+        </w:rPr>
+      </w:pPr>
+      <w:r>
+        <w:rPr>
+          <w:rFonts w:ascii="Arial" w:eastAsia="Times New Roman" w:hAnsi="Arial" w:cs="Arial"/>
+          <w:color w:val="3B3B3B"/>
+          <w:kern w:val="0"/>
+          <w:sz w:val="20"/>
+          <w:szCs w:val="20"/>
         </w:rPr>
         <w:t>PD15 says </w:t>
       </w:r>
@@ -4398,7 +4384,6 @@
           <w:kern w:val="0"/>
           <w:sz w:val="20"/>
           <w:szCs w:val="20"/>
-          <w14:ligatures w14:val="none"/>
         </w:rPr>
         <w:t>archive it</w:t>
       </w:r>
@@ -4409,7 +4394,6 @@
           <w:kern w:val="0"/>
           <w:sz w:val="20"/>
           <w:szCs w:val="20"/>
-          <w14:ligatures w14:val="none"/>
         </w:rPr>
         <w:t> and replace with something shorter, phased:</w:t>
       </w:r>
@@ -4424,32 +4408,31 @@
           <w:kern w:val="0"/>
           <w:sz w:val="20"/>
           <w:szCs w:val="20"/>
-          <w14:ligatures w14:val="none"/>
-        </w:rPr>
-      </w:pPr>
-      <w:r>
-        <w:rPr>
-          <w:rFonts w:ascii="Arial" w:eastAsia="Times New Roman" w:hAnsi="Arial" w:cs="Arial"/>
-          <w:b/>
-          <w:bCs/>
-          <w:color w:val="3B3B3B"/>
-          <w:kern w:val="0"/>
-          <w:sz w:val="20"/>
-          <w:szCs w:val="20"/>
-          <w14:ligatures w14:val="none"/>
+        </w:rPr>
+      </w:pPr>
+      <w:r>
+        <w:rPr>
+          <w:rFonts w:ascii="Arial" w:eastAsia="Times New Roman" w:hAnsi="Arial" w:cs="Arial"/>
+          <w:b/>
+          <w:bCs/>
+          <w:color w:val="3B3B3B"/>
+          <w:kern w:val="0"/>
+          <w:sz w:val="20"/>
+          <w:szCs w:val="20"/>
         </w:rPr>
         <w:t>Phase A — Gallery honesty (1–2 days)</w:t>
       </w:r>
       <w:r>
-        <w:rPr>
-          <w:rFonts w:ascii="Arial" w:eastAsia="Times New Roman" w:hAnsi="Arial" w:cs="Arial"/>
-          <w:color w:val="3B3B3B"/>
-          <w:kern w:val="0"/>
-          <w:sz w:val="20"/>
-          <w:szCs w:val="20"/>
-          <w14:ligatures w14:val="none"/>
-        </w:rPr>
         <w:br/>
+      </w:r>
+      <w:r>
+        <w:rPr>
+          <w:rFonts w:ascii="Arial" w:eastAsia="Times New Roman" w:hAnsi="Arial" w:cs="Arial"/>
+          <w:color w:val="3B3B3B"/>
+          <w:kern w:val="0"/>
+          <w:sz w:val="20"/>
+          <w:szCs w:val="20"/>
+        </w:rPr>
         <w:t>λ panel, sim double-plots, sort-and-chop back, fitted-distribution callouts.</w:t>
       </w:r>
     </w:p>
@@ -4463,32 +4446,31 @@
           <w:kern w:val="0"/>
           <w:sz w:val="20"/>
           <w:szCs w:val="20"/>
-          <w14:ligatures w14:val="none"/>
-        </w:rPr>
-      </w:pPr>
-      <w:r>
-        <w:rPr>
-          <w:rFonts w:ascii="Arial" w:eastAsia="Times New Roman" w:hAnsi="Arial" w:cs="Arial"/>
-          <w:b/>
-          <w:bCs/>
-          <w:color w:val="3B3B3B"/>
-          <w:kern w:val="0"/>
-          <w:sz w:val="20"/>
-          <w:szCs w:val="20"/>
-          <w14:ligatures w14:val="none"/>
+        </w:rPr>
+      </w:pPr>
+      <w:r>
+        <w:rPr>
+          <w:rFonts w:ascii="Arial" w:eastAsia="Times New Roman" w:hAnsi="Arial" w:cs="Arial"/>
+          <w:b/>
+          <w:bCs/>
+          <w:color w:val="3B3B3B"/>
+          <w:kern w:val="0"/>
+          <w:sz w:val="20"/>
+          <w:szCs w:val="20"/>
         </w:rPr>
         <w:t>Phase B — Characterization deck (~4 days)</w:t>
       </w:r>
       <w:r>
-        <w:rPr>
-          <w:rFonts w:ascii="Arial" w:eastAsia="Times New Roman" w:hAnsi="Arial" w:cs="Arial"/>
-          <w:color w:val="3B3B3B"/>
-          <w:kern w:val="0"/>
-          <w:sz w:val="20"/>
-          <w:szCs w:val="20"/>
-          <w14:ligatures w14:val="none"/>
-        </w:rPr>
         <w:br/>
+      </w:r>
+      <w:r>
+        <w:rPr>
+          <w:rFonts w:ascii="Arial" w:eastAsia="Times New Roman" w:hAnsi="Arial" w:cs="Arial"/>
+          <w:color w:val="3B3B3B"/>
+          <w:kern w:val="0"/>
+          <w:sz w:val="20"/>
+          <w:szCs w:val="20"/>
+        </w:rPr>
         <w:t xml:space="preserve">ρ → λ → θ/γ → A distribution → </w:t>
       </w:r>
       <m:oMath>
@@ -4541,7 +4523,6 @@
           <w:kern w:val="0"/>
           <w:sz w:val="20"/>
           <w:szCs w:val="20"/>
-          <w14:ligatures w14:val="none"/>
         </w:rPr>
         <w:t xml:space="preserve"> → K/N. Checkpoint after ρ + λ.</w:t>
       </w:r>
@@ -4556,53 +4537,40 @@
           <w:kern w:val="0"/>
           <w:sz w:val="20"/>
           <w:szCs w:val="20"/>
-          <w14:ligatures w14:val="none"/>
-        </w:rPr>
-      </w:pPr>
-      <w:r>
-        <w:rPr>
-          <w:rFonts w:ascii="Arial" w:eastAsia="Times New Roman" w:hAnsi="Arial" w:cs="Arial"/>
-          <w:b/>
-          <w:bCs/>
-          <w:color w:val="3B3B3B"/>
-          <w:kern w:val="0"/>
-          <w:sz w:val="20"/>
-          <w:szCs w:val="20"/>
-          <w14:ligatures w14:val="none"/>
+        </w:rPr>
+      </w:pPr>
+      <w:r>
+        <w:rPr>
+          <w:rFonts w:ascii="Arial" w:eastAsia="Times New Roman" w:hAnsi="Arial" w:cs="Arial"/>
+          <w:b/>
+          <w:bCs/>
+          <w:color w:val="3B3B3B"/>
+          <w:kern w:val="0"/>
+          <w:sz w:val="20"/>
+          <w:szCs w:val="20"/>
         </w:rPr>
         <w:t>Phase C — Statistical fitting (later)</w:t>
       </w:r>
       <w:r>
-        <w:rPr>
-          <w:rFonts w:ascii="Arial" w:eastAsia="Times New Roman" w:hAnsi="Arial" w:cs="Arial"/>
-          <w:color w:val="3B3B3B"/>
-          <w:kern w:val="0"/>
-          <w:sz w:val="20"/>
-          <w:szCs w:val="20"/>
-          <w14:ligatures w14:val="none"/>
-        </w:rPr>
         <w:br/>
+      </w:r>
+      <w:r>
+        <w:rPr>
+          <w:rFonts w:ascii="Arial" w:eastAsia="Times New Roman" w:hAnsi="Arial" w:cs="Arial"/>
+          <w:color w:val="3B3B3B"/>
+          <w:kern w:val="0"/>
+          <w:sz w:val="20"/>
+          <w:szCs w:val="20"/>
+        </w:rPr>
         <w:t xml:space="preserve">Data statistics for </w:t>
       </w:r>
       <w:r>
         <w:rPr>
-          <w:rFonts w:ascii="Arial" w:eastAsia="Times New Roman" w:hAnsi="Arial" w:cs="Arial"/>
-          <w:color w:val="3B3B3B"/>
-          <w:kern w:val="0"/>
-          <w:sz w:val="20"/>
-          <w:szCs w:val="20"/>
-          <w14:ligatures w14:val="none"/>
-        </w:rPr>
-        <w:sym w:font="Symbol" w:char="F072"/>
-      </w:r>
-      <w:r>
-        <w:rPr>
           <w:rFonts w:ascii="Cambria Math" w:eastAsia="Times New Roman" w:hAnsi="Cambria Math" w:cs="Arial"/>
           <w:color w:val="3B3B3B"/>
           <w:kern w:val="0"/>
           <w:sz w:val="20"/>
           <w:szCs w:val="20"/>
-          <w14:ligatures w14:val="none"/>
         </w:rPr>
         <w:t xml:space="preserve">ˆ </w:t>
       </w:r>
@@ -4613,31 +4581,8 @@
           <w:kern w:val="0"/>
           <w:sz w:val="20"/>
           <w:szCs w:val="20"/>
-          <w14:ligatures w14:val="none"/>
-        </w:rPr>
-        <w:t>and λ̂</w:t>
-      </w:r>
-      <w:r>
-        <w:rPr>
-          <w:rFonts w:ascii="Arial" w:eastAsia="Times New Roman" w:hAnsi="Arial" w:cs="Arial"/>
-          <w:color w:val="3B3B3B"/>
-          <w:kern w:val="0"/>
-          <w:sz w:val="20"/>
-          <w:szCs w:val="20"/>
-          <w14:ligatures w14:val="none"/>
-        </w:rPr>
-        <w:t xml:space="preserve"> </w:t>
-      </w:r>
-      <w:r>
-        <w:rPr>
-          <w:rFonts w:ascii="Arial" w:eastAsia="Times New Roman" w:hAnsi="Arial" w:cs="Arial"/>
-          <w:color w:val="3B3B3B"/>
-          <w:kern w:val="0"/>
-          <w:sz w:val="20"/>
-          <w:szCs w:val="20"/>
-          <w14:ligatures w14:val="none"/>
-        </w:rPr>
-        <w:t>; then revisit PD14 magnitude.</w:t>
+        </w:rPr>
+        <w:t>and λ̂ ; then revisit PD14 magnitude.</w:t>
       </w:r>
     </w:p>
     <w:p>
@@ -4650,19 +4595,17 @@
           <w:kern w:val="0"/>
           <w:sz w:val="20"/>
           <w:szCs w:val="20"/>
-          <w14:ligatures w14:val="none"/>
-        </w:rPr>
-      </w:pPr>
-      <w:r>
-        <w:rPr>
-          <w:rFonts w:ascii="Arial" w:eastAsia="Times New Roman" w:hAnsi="Arial" w:cs="Arial"/>
-          <w:b/>
-          <w:bCs/>
-          <w:color w:val="3B3B3B"/>
-          <w:kern w:val="0"/>
-          <w:sz w:val="20"/>
-          <w:szCs w:val="20"/>
-          <w14:ligatures w14:val="none"/>
+        </w:rPr>
+      </w:pPr>
+      <w:r>
+        <w:rPr>
+          <w:rFonts w:ascii="Arial" w:eastAsia="Times New Roman" w:hAnsi="Arial" w:cs="Arial"/>
+          <w:b/>
+          <w:bCs/>
+          <w:color w:val="3B3B3B"/>
+          <w:kern w:val="0"/>
+          <w:sz w:val="20"/>
+          <w:szCs w:val="20"/>
         </w:rPr>
         <w:t>Still parked:</w:t>
       </w:r>
@@ -4673,7 +4616,6 @@
           <w:kern w:val="0"/>
           <w:sz w:val="20"/>
           <w:szCs w:val="20"/>
-          <w14:ligatures w14:val="none"/>
         </w:rPr>
         <w:t> B/D split, Rivanna hero rebuild, army figures, bin-16 prose polish.</w:t>
       </w:r>
@@ -4686,22 +4628,8 @@
           <w:kern w:val="0"/>
           <w:sz w:val="20"/>
           <w:szCs w:val="20"/>
-          <w14:ligatures w14:val="none"/>
-        </w:rPr>
-      </w:pPr>
-      <w:r>
-        <w:rPr>
-          <w:noProof/>
-        </w:rPr>
-      </w:r>
-      <w:r>
-        <w:pict w14:anchorId="3D4CD4CB">
-          <v:rect id="Horizontal Line 13" o:spid="_x0000_s1027" style="width:540pt;height:.05pt;visibility:visible;mso-wrap-style:square;mso-left-percent:-10001;mso-top-percent:-10001;mso-position-horizontal:absolute;mso-position-horizontal-relative:char;mso-position-vertical:absolute;mso-position-vertical-relative:line;mso-left-percent:-10001;mso-top-percent:-10001;v-text-anchor:top" o:gfxdata="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" filled="f">
-            <o:lock v:ext="edit" rotation="t" aspectratio="t" verticies="t" text="t" shapetype="t"/>
-            <w10:anchorlock/>
-          </v:rect>
-        </w:pict>
-      </w:r>
+        </w:rPr>
+      </w:pPr>
     </w:p>
     <w:p>
       <w:pPr>
@@ -4716,21 +4644,13 @@
           <w:kern w:val="0"/>
           <w:sz w:val="32"/>
           <w:szCs w:val="32"/>
-          <w14:ligatures w14:val="none"/>
-        </w:rPr>
-      </w:pPr>
-      <w:r>
-        <w:rPr>
-          <w:rFonts w:ascii="Arial" w:eastAsia="Times New Roman" w:hAnsi="Arial" w:cs="Arial"/>
-          <w:b/>
-          <w:bCs/>
-          <w:color w:val="3B3B3B"/>
-          <w:kern w:val="0"/>
-          <w:sz w:val="32"/>
-          <w:szCs w:val="32"/>
-          <w14:ligatures w14:val="none"/>
-        </w:rPr>
-        <w:t>Things I’ll ask you when we write the checklist</w:t>
+        </w:rPr>
+      </w:pPr>
+      <w:r>
+        <w:rPr>
+          <w:rFonts w:cs="Aptos"/>
+        </w:rPr>
+        <w:t>Open questions (Charles, 2026-08-03)</w:t>
       </w:r>
     </w:p>
     <w:p>
@@ -4747,56 +4667,27 @@
           <w:kern w:val="0"/>
           <w:sz w:val="20"/>
           <w:szCs w:val="20"/>
-          <w14:ligatures w14:val="none"/>
-        </w:rPr>
-      </w:pPr>
-      <w:r>
-        <w:rPr>
-          <w:rFonts w:ascii="Arial" w:eastAsia="Times New Roman" w:hAnsi="Arial" w:cs="Arial"/>
-          <w:b/>
-          <w:bCs/>
-          <w:color w:val="3B3B3B"/>
-          <w:kern w:val="0"/>
-          <w:sz w:val="20"/>
-          <w:szCs w:val="20"/>
-          <w14:ligatures w14:val="none"/>
-        </w:rPr>
-        <w:t>Board vs screen:</w:t>
-      </w:r>
-      <w:r>
-        <w:rPr>
-          <w:rFonts w:ascii="Arial" w:eastAsia="Times New Roman" w:hAnsi="Arial" w:cs="Arial"/>
-          <w:color w:val="3B3B3B"/>
-          <w:kern w:val="0"/>
-          <w:sz w:val="20"/>
-          <w:szCs w:val="20"/>
-          <w14:ligatures w14:val="none"/>
-        </w:rPr>
-        <w:t> When Alex said “flat without assortativity,” was that </w:t>
-      </w:r>
-      <w:r>
-        <w:rPr>
-          <w:rFonts w:ascii="Arial" w:eastAsia="Times New Roman" w:hAnsi="Arial" w:cs="Arial"/>
-          <w:b/>
-          <w:bCs/>
-          <w:color w:val="3B3B3B"/>
-          <w:kern w:val="0"/>
-          <w:sz w:val="20"/>
-          <w:szCs w:val="20"/>
-          <w14:ligatures w14:val="none"/>
-        </w:rPr>
-        <w:t>Pass C on screen</w:t>
-      </w:r>
-      <w:r>
-        <w:rPr>
-          <w:rFonts w:ascii="Arial" w:eastAsia="Times New Roman" w:hAnsi="Arial" w:cs="Arial"/>
-          <w:color w:val="3B3B3B"/>
-          <w:kern w:val="0"/>
-          <w:sz w:val="20"/>
-          <w:szCs w:val="20"/>
-          <w14:ligatures w14:val="none"/>
-        </w:rPr>
-        <w:t>? (I’m assuming yes.)</w:t>
+        </w:rPr>
+      </w:pPr>
+      <w:r>
+        <w:rPr>
+          <w:rFonts w:cs="Aptos"/>
+        </w:rPr>
+        <w:t xml:space="preserve">Board vs screen: When Alex said “flat without </w:t>
+      </w:r>
+      <w:proofErr w:type="spellStart"/>
+      <w:r>
+        <w:rPr>
+          <w:rFonts w:cs="Aptos"/>
+        </w:rPr>
+        <w:t>assortativity</w:t>
+      </w:r>
+      <w:proofErr w:type="spellEnd"/>
+      <w:r>
+        <w:rPr>
+          <w:rFonts w:cs="Aptos"/>
+        </w:rPr>
+        <w:t>,” was that Pass C on screen? Yes — Pass C.</w:t>
       </w:r>
     </w:p>
     <w:p>
@@ -4813,86 +4704,27 @@
           <w:kern w:val="0"/>
           <w:sz w:val="20"/>
           <w:szCs w:val="20"/>
-          <w14:ligatures w14:val="none"/>
-        </w:rPr>
-      </w:pPr>
-      <w:r>
-        <w:rPr>
-          <w:rFonts w:ascii="Arial" w:eastAsia="Times New Roman" w:hAnsi="Arial" w:cs="Arial"/>
-          <w:b/>
-          <w:bCs/>
-          <w:color w:val="3B3B3B"/>
-          <w:kern w:val="0"/>
-          <w:sz w:val="20"/>
-          <w:szCs w:val="20"/>
-          <w14:ligatures w14:val="none"/>
-        </w:rPr>
-        <w:t>Double-plot target:</w:t>
-      </w:r>
-      <w:r>
-        <w:rPr>
-          <w:rFonts w:ascii="Arial" w:eastAsia="Times New Roman" w:hAnsi="Arial" w:cs="Arial"/>
-          <w:color w:val="3B3B3B"/>
-          <w:kern w:val="0"/>
-          <w:sz w:val="20"/>
-          <w:szCs w:val="20"/>
-          <w14:ligatures w14:val="none"/>
-        </w:rPr>
-        <w:t xml:space="preserve"> Left = </w:t>
-      </w:r>
-      <m:oMath>
-        <m:sSub>
-          <m:sSubPr>
-            <m:ctrlPr>
-              <w:rPr>
-                <w:rFonts w:ascii="Cambria Math" w:eastAsia="Times New Roman" w:hAnsi="Cambria Math" w:cs="Arial"/>
-                <w:i/>
-                <w:color w:val="3B3B3B"/>
-                <w:kern w:val="0"/>
-                <w:sz w:val="20"/>
-                <w:szCs w:val="20"/>
-                <w14:ligatures w14:val="none"/>
-              </w:rPr>
-            </m:ctrlPr>
-          </m:sSubPr>
-          <m:e>
-            <m:r>
-              <w:rPr>
-                <w:rFonts w:ascii="Cambria Math" w:eastAsia="Times New Roman" w:hAnsi="Cambria Math" w:cs="Arial"/>
-                <w:color w:val="3B3B3B"/>
-                <w:kern w:val="0"/>
-                <w:sz w:val="20"/>
-                <w:szCs w:val="20"/>
-                <w14:ligatures w14:val="none"/>
-              </w:rPr>
-              <m:t>A</m:t>
-            </m:r>
-          </m:e>
-          <m:sub>
-            <m:r>
-              <w:rPr>
-                <w:rFonts w:ascii="Cambria Math" w:eastAsia="Times New Roman" w:hAnsi="Cambria Math" w:cs="Arial"/>
-                <w:color w:val="3B3B3B"/>
-                <w:kern w:val="0"/>
-                <w:sz w:val="20"/>
-                <w:szCs w:val="20"/>
-                <w14:ligatures w14:val="none"/>
-              </w:rPr>
-              <m:t>i</m:t>
-            </m:r>
-          </m:sub>
-        </m:sSub>
-      </m:oMath>
-      <w:r>
-        <w:rPr>
-          <w:rFonts w:ascii="Arial" w:eastAsia="Times New Roman" w:hAnsi="Arial" w:cs="Arial"/>
-          <w:color w:val="3B3B3B"/>
-          <w:kern w:val="0"/>
-          <w:sz w:val="20"/>
-          <w:szCs w:val="20"/>
-          <w14:ligatures w14:val="none"/>
-        </w:rPr>
-        <w:t>-binned, right = poolq_loo-binned, same sim run — still your read?</w:t>
+        </w:rPr>
+      </w:pPr>
+      <w:r>
+        <w:rPr>
+          <w:rFonts w:cs="Aptos"/>
+        </w:rPr>
+        <w:t xml:space="preserve">Double-plot target: Left = </w:t>
+      </w:r>
+      <w:proofErr w:type="spellStart"/>
+      <w:r>
+        <w:rPr>
+          <w:rFonts w:cs="Aptos"/>
+        </w:rPr>
+        <w:t>A_i</w:t>
+      </w:r>
+      <w:proofErr w:type="spellEnd"/>
+      <w:r>
+        <w:rPr>
+          <w:rFonts w:cs="Aptos"/>
+        </w:rPr>
+        <w:t>-binned, right = poolq_loo-binned, same sim run? Yes — confirmed.</w:t>
       </w:r>
     </w:p>
     <w:p>
@@ -4909,57 +4741,98 @@
           <w:kern w:val="0"/>
           <w:sz w:val="20"/>
           <w:szCs w:val="20"/>
-          <w14:ligatures w14:val="none"/>
-        </w:rPr>
-      </w:pPr>
-      <w:r>
-        <w:rPr>
-          <w:rFonts w:ascii="Arial" w:eastAsia="Times New Roman" w:hAnsi="Arial" w:cs="Arial"/>
-          <w:b/>
-          <w:bCs/>
-          <w:color w:val="3B3B3B"/>
-          <w:kern w:val="0"/>
-          <w:sz w:val="20"/>
-          <w:szCs w:val="20"/>
-          <w14:ligatures w14:val="none"/>
-        </w:rPr>
-        <w:t>λ sign on Model slide:</w:t>
-      </w:r>
-      <w:r>
-        <w:rPr>
-          <w:rFonts w:ascii="Arial" w:eastAsia="Times New Roman" w:hAnsi="Arial" w:cs="Arial"/>
-          <w:color w:val="3B3B3B"/>
-          <w:kern w:val="0"/>
-          <w:sz w:val="20"/>
-          <w:szCs w:val="20"/>
-          <w14:ligatures w14:val="none"/>
-        </w:rPr>
-        <w:t xml:space="preserve"> You corrected him (λ = 0.55, </w:t>
+        </w:rPr>
+      </w:pPr>
+      <w:r>
+        <w:rPr>
+          <w:rFonts w:cs="Aptos"/>
+        </w:rPr>
+        <w:t xml:space="preserve">λ sign on Model slide: Use </w:t>
       </w:r>
       <m:oMath>
         <m:sSub>
           <m:sSubPr>
             <m:ctrlPr>
               <w:rPr>
-                <w:rFonts w:ascii="Cambria Math" w:eastAsia="Times New Roman" w:hAnsi="Cambria Math" w:cs="Arial"/>
+                <w:rFonts w:ascii="Cambria Math" w:hAnsi="Cambria Math" w:cs="Aptos"/>
                 <w:i/>
-                <w:color w:val="3B3B3B"/>
-                <w:kern w:val="0"/>
-                <w:sz w:val="20"/>
-                <w:szCs w:val="20"/>
-                <w14:ligatures w14:val="none"/>
               </w:rPr>
             </m:ctrlPr>
           </m:sSubPr>
           <m:e>
             <m:r>
               <w:rPr>
-                <w:rFonts w:ascii="Cambria Math" w:eastAsia="Times New Roman" w:hAnsi="Cambria Math" w:cs="Arial"/>
-                <w:color w:val="3B3B3B"/>
-                <w:kern w:val="0"/>
-                <w:sz w:val="20"/>
-                <w:szCs w:val="20"/>
-                <w14:ligatures w14:val="none"/>
+                <w:rFonts w:ascii="Cambria Math" w:hAnsi="Cambria Math" w:cs="Aptos"/>
+              </w:rPr>
+              <m:t>S</m:t>
+            </m:r>
+          </m:e>
+          <m:sub>
+            <m:r>
+              <w:rPr>
+                <w:rFonts w:ascii="Cambria Math" w:hAnsi="Cambria Math" w:cs="Aptos"/>
+              </w:rPr>
+              <m:t>i</m:t>
+            </m:r>
+          </m:sub>
+        </m:sSub>
+        <m:r>
+          <w:rPr>
+            <w:rFonts w:ascii="Cambria Math" w:hAnsi="Cambria Math" w:cs="Aptos"/>
+          </w:rPr>
+          <m:t xml:space="preserve">= </m:t>
+        </m:r>
+        <m:sSub>
+          <m:sSubPr>
+            <m:ctrlPr>
+              <w:rPr>
+                <w:rFonts w:ascii="Cambria Math" w:hAnsi="Cambria Math" w:cs="Aptos"/>
+                <w:i/>
+              </w:rPr>
+            </m:ctrlPr>
+          </m:sSubPr>
+          <m:e>
+            <m:r>
+              <w:rPr>
+                <w:rFonts w:ascii="Cambria Math" w:hAnsi="Cambria Math" w:cs="Aptos"/>
+              </w:rPr>
+              <m:t>A</m:t>
+            </m:r>
+          </m:e>
+          <m:sub>
+            <m:r>
+              <w:rPr>
+                <w:rFonts w:ascii="Cambria Math" w:hAnsi="Cambria Math" w:cs="Aptos"/>
+              </w:rPr>
+              <m:t>i</m:t>
+            </m:r>
+          </m:sub>
+        </m:sSub>
+        <m:r>
+          <w:rPr>
+            <w:rFonts w:ascii="Cambria Math" w:hAnsi="Cambria Math" w:cs="Aptos"/>
+          </w:rPr>
+          <m:t>–</m:t>
+        </m:r>
+        <m:r>
+          <w:rPr>
+            <w:rFonts w:ascii="Cambria Math" w:hAnsi="Cambria Math" w:cs="Aptos"/>
+          </w:rPr>
+          <m:t xml:space="preserve"> λ </m:t>
+        </m:r>
+        <m:sSub>
+          <m:sSubPr>
+            <m:ctrlPr>
+              <w:rPr>
+                <w:rFonts w:ascii="Cambria Math" w:hAnsi="Cambria Math" w:cs="Aptos"/>
+                <w:i/>
+              </w:rPr>
+            </m:ctrlPr>
+          </m:sSubPr>
+          <m:e>
+            <m:r>
+              <w:rPr>
+                <w:rFonts w:ascii="Cambria Math" w:hAnsi="Cambria Math" w:cs="Aptos"/>
               </w:rPr>
               <m:t>L</m:t>
             </m:r>
@@ -4967,12 +4840,7 @@
           <m:sub>
             <m:r>
               <w:rPr>
-                <w:rFonts w:ascii="Cambria Math" w:eastAsia="Times New Roman" w:hAnsi="Cambria Math" w:cs="Arial"/>
-                <w:color w:val="3B3B3B"/>
-                <w:kern w:val="0"/>
-                <w:sz w:val="20"/>
-                <w:szCs w:val="20"/>
-                <w14:ligatures w14:val="none"/>
+                <w:rFonts w:ascii="Cambria Math" w:hAnsi="Cambria Math" w:cs="Aptos"/>
               </w:rPr>
               <m:t>C</m:t>
             </m:r>
@@ -4981,38 +4849,15 @@
       </m:oMath>
       <w:r>
         <w:rPr>
-          <w:rFonts w:ascii="Arial" w:eastAsia="Times New Roman" w:hAnsi="Arial" w:cs="Arial"/>
-          <w:color w:val="3B3B3B"/>
-          <w:kern w:val="0"/>
-          <w:sz w:val="20"/>
-          <w:szCs w:val="20"/>
-          <w14:ligatures w14:val="none"/>
-        </w:rPr>
-        <w:t xml:space="preserve"> negative) — what’s on </w:t>
-      </w:r>
-      <w:r>
-        <w:rPr>
-          <w:rFonts w:ascii="Arial" w:eastAsia="Times New Roman" w:hAnsi="Arial" w:cs="Arial"/>
-          <w:b/>
-          <w:bCs/>
-          <w:color w:val="3B3B3B"/>
-          <w:kern w:val="0"/>
-          <w:sz w:val="20"/>
-          <w:szCs w:val="20"/>
-          <w14:ligatures w14:val="none"/>
-        </w:rPr>
-        <w:t>Model.pptx</w:t>
-      </w:r>
-      <w:r>
-        <w:rPr>
-          <w:rFonts w:ascii="Arial" w:eastAsia="Times New Roman" w:hAnsi="Arial" w:cs="Arial"/>
-          <w:color w:val="3B3B3B"/>
-          <w:kern w:val="0"/>
-          <w:sz w:val="20"/>
-          <w:szCs w:val="20"/>
-          <w14:ligatures w14:val="none"/>
-        </w:rPr>
-        <w:t> now?</w:t>
+          <w:rFonts w:eastAsiaTheme="minorEastAsia" w:cs="Aptos"/>
+        </w:rPr>
+        <w:t xml:space="preserve">  </w:t>
+      </w:r>
+      <w:r>
+        <w:rPr>
+          <w:rFonts w:cs="Aptos"/>
+        </w:rPr>
+        <w:t>(λ &gt; 0; congestion enters with a minus sign). Matches the meeting correction to Alex.</w:t>
       </w:r>
     </w:p>
     <w:p>
@@ -5029,32 +4874,13 @@
           <w:kern w:val="0"/>
           <w:sz w:val="20"/>
           <w:szCs w:val="20"/>
-          <w14:ligatures w14:val="none"/>
-        </w:rPr>
-      </w:pPr>
-      <w:r>
-        <w:rPr>
-          <w:rFonts w:ascii="Arial" w:eastAsia="Times New Roman" w:hAnsi="Arial" w:cs="Arial"/>
-          <w:b/>
-          <w:bCs/>
-          <w:color w:val="3B3B3B"/>
-          <w:kern w:val="0"/>
-          <w:sz w:val="20"/>
-          <w:szCs w:val="20"/>
-          <w14:ligatures w14:val="none"/>
-        </w:rPr>
-        <w:t>PD14:</w:t>
-      </w:r>
-      <w:r>
-        <w:rPr>
-          <w:rFonts w:ascii="Arial" w:eastAsia="Times New Roman" w:hAnsi="Arial" w:cs="Arial"/>
-          <w:color w:val="3B3B3B"/>
-          <w:kern w:val="0"/>
-          <w:sz w:val="20"/>
-          <w:szCs w:val="20"/>
-          <w14:ligatures w14:val="none"/>
-        </w:rPr>
-        <w:t> Park until after Phase B, or keep as parallel track?</w:t>
+        </w:rPr>
+      </w:pPr>
+      <w:r>
+        <w:rPr>
+          <w:rFonts w:cs="Aptos"/>
+        </w:rPr>
+        <w:t>PD14: Park until after Phase B, or keep as parallel track? Park until after Phase B.</w:t>
       </w:r>
     </w:p>
     <w:p>
@@ -5065,22 +4891,8 @@
           <w:kern w:val="0"/>
           <w:sz w:val="20"/>
           <w:szCs w:val="20"/>
-          <w14:ligatures w14:val="none"/>
-        </w:rPr>
-      </w:pPr>
-      <w:r>
-        <w:rPr>
-          <w:noProof/>
-        </w:rPr>
-      </w:r>
-      <w:r>
-        <w:pict w14:anchorId="2BF07B25">
-          <v:rect id="Horizontal Line 14" o:spid="_x0000_s1026" style="width:540pt;height:1.1pt;visibility:visible;mso-wrap-style:square;mso-left-percent:-10001;mso-top-percent:-10001;mso-position-horizontal:absolute;mso-position-horizontal-relative:char;mso-position-vertical:absolute;mso-position-vertical-relative:line;mso-left-percent:-10001;mso-top-percent:-10001;v-text-anchor:top" o:gfxdata="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" filled="f">
-            <o:lock v:ext="edit" rotation="t" aspectratio="t" verticies="t" text="t" shapetype="t"/>
-            <w10:anchorlock/>
-          </v:rect>
-        </w:pict>
-      </w:r>
+        </w:rPr>
+      </w:pPr>
     </w:p>
     <w:p>
       <w:pPr>
@@ -5095,7 +4907,6 @@
           <w:kern w:val="0"/>
           <w:sz w:val="32"/>
           <w:szCs w:val="32"/>
-          <w14:ligatures w14:val="none"/>
         </w:rPr>
       </w:pPr>
       <w:r>
@@ -5107,7 +4918,6 @@
           <w:kern w:val="0"/>
           <w:sz w:val="32"/>
           <w:szCs w:val="32"/>
-          <w14:ligatures w14:val="none"/>
         </w:rPr>
         <w:t>Bottom line</w:t>
       </w:r>
@@ -5122,17 +4932,15 @@
           <w:kern w:val="0"/>
           <w:sz w:val="20"/>
           <w:szCs w:val="20"/>
-          <w14:ligatures w14:val="none"/>
-        </w:rPr>
-      </w:pPr>
-      <w:r>
-        <w:rPr>
-          <w:rFonts w:ascii="Arial" w:eastAsia="Times New Roman" w:hAnsi="Arial" w:cs="Arial"/>
-          <w:color w:val="3B3B3B"/>
-          <w:kern w:val="0"/>
-          <w:sz w:val="20"/>
-          <w:szCs w:val="20"/>
-          <w14:ligatures w14:val="none"/>
+        </w:rPr>
+      </w:pPr>
+      <w:r>
+        <w:rPr>
+          <w:rFonts w:ascii="Arial" w:eastAsia="Times New Roman" w:hAnsi="Arial" w:cs="Arial"/>
+          <w:color w:val="3B3B3B"/>
+          <w:kern w:val="0"/>
+          <w:sz w:val="20"/>
+          <w:szCs w:val="20"/>
         </w:rPr>
         <w:t>You didn’t waste the last two weeks. Alex said the Pass work is </w:t>
       </w:r>
@@ -5145,7 +4953,6 @@
           <w:kern w:val="0"/>
           <w:sz w:val="20"/>
           <w:szCs w:val="20"/>
-          <w14:ligatures w14:val="none"/>
         </w:rPr>
         <w:t>right</w:t>
       </w:r>
@@ -5156,7 +4963,6 @@
           <w:kern w:val="0"/>
           <w:sz w:val="20"/>
           <w:szCs w:val="20"/>
-          <w14:ligatures w14:val="none"/>
         </w:rPr>
         <w:t>. The job now is </w:t>
       </w:r>
@@ -5169,7 +4975,6 @@
           <w:kern w:val="0"/>
           <w:sz w:val="20"/>
           <w:szCs w:val="20"/>
-          <w14:ligatures w14:val="none"/>
         </w:rPr>
         <w:t>directed characterization</w:t>
       </w:r>
@@ -5180,7 +4985,6 @@
           <w:kern w:val="0"/>
           <w:sz w:val="20"/>
           <w:szCs w:val="20"/>
-          <w14:ligatures w14:val="none"/>
         </w:rPr>
         <w:t> — fewer checklist items, standard slides, two curves every time — then </w:t>
       </w:r>
@@ -5193,7 +4997,6 @@
           <w:kern w:val="0"/>
           <w:sz w:val="20"/>
           <w:szCs w:val="20"/>
-          <w14:ligatures w14:val="none"/>
         </w:rPr>
         <w:t>fit ρ and λ to data statistics</w:t>
       </w:r>
@@ -5204,7 +5007,6 @@
           <w:kern w:val="0"/>
           <w:sz w:val="20"/>
           <w:szCs w:val="20"/>
-          <w14:ligatures w14:val="none"/>
         </w:rPr>
         <w:t>, not to curve shape.</w:t>
       </w:r>
@@ -5219,17 +5021,15 @@
           <w:kern w:val="0"/>
           <w:sz w:val="20"/>
           <w:szCs w:val="20"/>
-          <w14:ligatures w14:val="none"/>
-        </w:rPr>
-      </w:pPr>
-      <w:r>
-        <w:rPr>
-          <w:rFonts w:ascii="Arial" w:eastAsia="Times New Roman" w:hAnsi="Arial" w:cs="Arial"/>
-          <w:color w:val="3B3B3B"/>
-          <w:kern w:val="0"/>
-          <w:sz w:val="20"/>
-          <w:szCs w:val="20"/>
-          <w14:ligatures w14:val="none"/>
+        </w:rPr>
+      </w:pPr>
+      <w:r>
+        <w:rPr>
+          <w:rFonts w:ascii="Arial" w:eastAsia="Times New Roman" w:hAnsi="Arial" w:cs="Arial"/>
+          <w:color w:val="3B3B3B"/>
+          <w:kern w:val="0"/>
+          <w:sz w:val="20"/>
+          <w:szCs w:val="20"/>
         </w:rPr>
         <w:t>When you want, we can archive </w:t>
       </w:r>
@@ -5240,7 +5040,6 @@
           <w:kern w:val="0"/>
           <w:sz w:val="18"/>
           <w:szCs w:val="18"/>
-          <w14:ligatures w14:val="none"/>
         </w:rPr>
         <w:t>CHARLES_CHECKLIST.md</w:t>
       </w:r>
@@ -5251,7 +5050,6 @@
           <w:kern w:val="0"/>
           <w:sz w:val="20"/>
           <w:szCs w:val="20"/>
-          <w14:ligatures w14:val="none"/>
         </w:rPr>
         <w:t> and draft a </w:t>
       </w:r>
@@ -5264,7 +5062,6 @@
           <w:kern w:val="0"/>
           <w:sz w:val="20"/>
           <w:szCs w:val="20"/>
-          <w14:ligatures w14:val="none"/>
         </w:rPr>
         <w:t>~15–20 item PD15 checklist</w:t>
       </w:r>
@@ -5275,7 +5072,6 @@
           <w:kern w:val="0"/>
           <w:sz w:val="20"/>
           <w:szCs w:val="20"/>
-          <w14:ligatures w14:val="none"/>
         </w:rPr>
         <w:t> using </w:t>
       </w:r>
@@ -5288,7 +5084,6 @@
           <w:kern w:val="0"/>
           <w:sz w:val="20"/>
           <w:szCs w:val="20"/>
-          <w14:ligatures w14:val="none"/>
         </w:rPr>
         <w:t>Pass A / B / C as on your slides</w:t>
       </w:r>
@@ -5299,7 +5094,6 @@
           <w:kern w:val="0"/>
           <w:sz w:val="20"/>
           <w:szCs w:val="20"/>
-          <w14:ligatures w14:val="none"/>
         </w:rPr>
         <w:t>.</w:t>
       </w:r>

</xml_diff>